<commit_message>
delete unnecessary annotation and update DOC
</commit_message>
<xml_diff>
--- a/Doc/Doc_extra.docx
+++ b/Doc/Doc_extra.docx
@@ -976,7 +976,7 @@
                 <w:noProof/>
                 <w:webHidden/>
               </w:rPr>
-              <w:t>3</w:t>
+              <w:t>4</w:t>
             </w:r>
             <w:r>
               <w:rPr>
@@ -1046,7 +1046,7 @@
                 <w:noProof/>
                 <w:webHidden/>
               </w:rPr>
-              <w:t>4</w:t>
+              <w:t>5</w:t>
             </w:r>
             <w:r>
               <w:rPr>
@@ -1116,7 +1116,7 @@
                 <w:noProof/>
                 <w:webHidden/>
               </w:rPr>
-              <w:t>4</w:t>
+              <w:t>5</w:t>
             </w:r>
             <w:r>
               <w:rPr>
@@ -2191,9 +2191,6 @@
       <w:pPr>
         <w:pStyle w:val="2"/>
         <w:jc w:val="both"/>
-        <w:rPr>
-          <w:rFonts w:hint="eastAsia"/>
-        </w:rPr>
       </w:pPr>
       <w:bookmarkStart w:id="6" w:name="_Toc211032647"/>
       <w:r>
@@ -2203,17 +2200,19 @@
     </w:p>
     <w:p>
       <w:pPr>
-        <w:jc w:val="both"/>
-        <w:rPr>
-          <w:rFonts w:hint="eastAsia"/>
-          <w:lang w:eastAsia="ko-KR"/>
-        </w:rPr>
-      </w:pPr>
-      <w:r>
+        <w:jc w:val="center"/>
+        <w:rPr>
+          <w:lang w:eastAsia="ko-KR"/>
+        </w:rPr>
+      </w:pPr>
+      <w:r>
+        <w:rPr>
+          <w:noProof/>
+        </w:rPr>
         <w:drawing>
-          <wp:inline distT="0" distB="0" distL="0" distR="0" wp14:anchorId="012B7258" wp14:editId="36E6D587">
-            <wp:extent cx="5868358" cy="1610139"/>
-            <wp:effectExtent l="0" t="0" r="0" b="9525"/>
+          <wp:inline distT="0" distB="0" distL="0" distR="0" wp14:anchorId="012B7258" wp14:editId="757B9192">
+            <wp:extent cx="5305425" cy="1455684"/>
+            <wp:effectExtent l="0" t="0" r="0" b="0"/>
             <wp:docPr id="516369440" name="그림 4" descr="텍스트, 스크린샷, 폰트, 번호이(가) 표시된 사진&#10;&#10;AI 생성 콘텐츠는 정확하지 않을 수 있습니다."/>
             <wp:cNvGraphicFramePr>
               <a:graphicFrameLocks xmlns:a="http://schemas.openxmlformats.org/drawingml/2006/main" noChangeAspect="1"/>
@@ -2243,7 +2242,7 @@
                   <pic:spPr bwMode="auto">
                     <a:xfrm>
                       <a:off x="0" y="0"/>
-                      <a:ext cx="5950157" cy="1632583"/>
+                      <a:ext cx="5395249" cy="1480329"/>
                     </a:xfrm>
                     <a:prstGeom prst="rect">
                       <a:avLst/>
@@ -2312,27 +2311,200 @@
           <w:bCs/>
           <w:lang w:eastAsia="ko-KR"/>
         </w:rPr>
-        <w:t>Adherence to Constraints</w:t>
-      </w:r>
-      <w:r>
-        <w:rPr>
-          <w:lang w:eastAsia="ko-KR"/>
-        </w:rPr>
-        <w:t xml:space="preserve">: As specified in the project requirements, core algorithms such as binarization, edge detection, and contour extraction were implemented manually, </w:t>
+        <w:t>Algorithm Details</w:t>
+      </w:r>
+      <w:r>
+        <w:rPr>
+          <w:lang w:eastAsia="ko-KR"/>
+        </w:rPr>
+        <w:t>:</w:t>
+      </w:r>
+    </w:p>
+    <w:p>
+      <w:pPr>
+        <w:numPr>
+          <w:ilvl w:val="1"/>
+          <w:numId w:val="13"/>
+        </w:numPr>
+        <w:rPr>
+          <w:lang w:eastAsia="ko-KR"/>
+        </w:rPr>
+      </w:pPr>
+      <w:r>
+        <w:rPr>
+          <w:b/>
+          <w:bCs/>
+          <w:lang w:eastAsia="ko-KR"/>
+        </w:rPr>
+        <w:t>Image Loading (</w:t>
+      </w:r>
+      <w:proofErr w:type="spellStart"/>
+      <w:r>
+        <w:rPr>
+          <w:b/>
+          <w:bCs/>
+          <w:lang w:eastAsia="ko-KR"/>
+        </w:rPr>
+        <w:t>loadImage</w:t>
+      </w:r>
+      <w:proofErr w:type="spellEnd"/>
+      <w:r>
+        <w:rPr>
+          <w:b/>
+          <w:bCs/>
+          <w:lang w:eastAsia="ko-KR"/>
+        </w:rPr>
+        <w:t>)</w:t>
+      </w:r>
+      <w:r>
+        <w:rPr>
+          <w:lang w:eastAsia="ko-KR"/>
+        </w:rPr>
+        <w:t xml:space="preserve">: The implementation uses </w:t>
       </w:r>
       <w:proofErr w:type="gramStart"/>
       <w:r>
         <w:rPr>
           <w:lang w:eastAsia="ko-KR"/>
         </w:rPr>
-        <w:t>with the exception of</w:t>
-      </w:r>
+        <w:t>cv::</w:t>
+      </w:r>
+      <w:proofErr w:type="spellStart"/>
       <w:proofErr w:type="gramEnd"/>
       <w:r>
         <w:rPr>
           <w:lang w:eastAsia="ko-KR"/>
         </w:rPr>
-        <w:t xml:space="preserve"> basic image I/O functions from the OpenCV library.</w:t>
+        <w:t>imdecode</w:t>
+      </w:r>
+      <w:proofErr w:type="spellEnd"/>
+      <w:r>
+        <w:rPr>
+          <w:lang w:eastAsia="ko-KR"/>
+        </w:rPr>
+        <w:t xml:space="preserve"> to load the image by first reading the entire file into a buffer. This method ensures that images can be loaded reliably, even if the file path contains non-ASCII characters.</w:t>
+      </w:r>
+    </w:p>
+    <w:p>
+      <w:pPr>
+        <w:numPr>
+          <w:ilvl w:val="1"/>
+          <w:numId w:val="13"/>
+        </w:numPr>
+        <w:rPr>
+          <w:lang w:eastAsia="ko-KR"/>
+        </w:rPr>
+      </w:pPr>
+      <w:r>
+        <w:rPr>
+          <w:b/>
+          <w:bCs/>
+          <w:lang w:eastAsia="ko-KR"/>
+        </w:rPr>
+        <w:t>Binarization (threshold)</w:t>
+      </w:r>
+      <w:r>
+        <w:rPr>
+          <w:lang w:eastAsia="ko-KR"/>
+        </w:rPr>
+        <w:t>: This function inverts the image, setting the object to white (255) and the background to black (0). This step is crucial preparation for the contour extraction algorithm, which is designed to trace white pixels.</w:t>
+      </w:r>
+    </w:p>
+    <w:p>
+      <w:pPr>
+        <w:numPr>
+          <w:ilvl w:val="1"/>
+          <w:numId w:val="13"/>
+        </w:numPr>
+        <w:rPr>
+          <w:lang w:eastAsia="ko-KR"/>
+        </w:rPr>
+      </w:pPr>
+      <w:r>
+        <w:rPr>
+          <w:b/>
+          <w:bCs/>
+          <w:lang w:eastAsia="ko-KR"/>
+        </w:rPr>
+        <w:t>Contour Extraction (</w:t>
+      </w:r>
+      <w:proofErr w:type="spellStart"/>
+      <w:r>
+        <w:rPr>
+          <w:b/>
+          <w:bCs/>
+          <w:lang w:eastAsia="ko-KR"/>
+        </w:rPr>
+        <w:t>findContour</w:t>
+      </w:r>
+      <w:proofErr w:type="spellEnd"/>
+      <w:r>
+        <w:rPr>
+          <w:b/>
+          <w:bCs/>
+          <w:lang w:eastAsia="ko-KR"/>
+        </w:rPr>
+        <w:t>)</w:t>
+      </w:r>
+      <w:r>
+        <w:rPr>
+          <w:lang w:eastAsia="ko-KR"/>
+        </w:rPr>
+        <w:t xml:space="preserve">: A custom contour-tracing algorithm was implemented. It operates by first scanning the image to find a starting pixel of the object. From there, it traces the object's boundary by </w:t>
+      </w:r>
+      <w:proofErr w:type="gramStart"/>
+      <w:r>
+        <w:rPr>
+          <w:lang w:eastAsia="ko-KR"/>
+        </w:rPr>
+        <w:lastRenderedPageBreak/>
+        <w:t>searching</w:t>
+      </w:r>
+      <w:proofErr w:type="gramEnd"/>
+      <w:r>
+        <w:rPr>
+          <w:lang w:eastAsia="ko-KR"/>
+        </w:rPr>
+        <w:t xml:space="preserve"> neighboring pixels in a clockwise order, storing the coordinates of the contour until it returns to the starting point.</w:t>
+      </w:r>
+    </w:p>
+    <w:p>
+      <w:pPr>
+        <w:numPr>
+          <w:ilvl w:val="0"/>
+          <w:numId w:val="13"/>
+        </w:numPr>
+        <w:rPr>
+          <w:lang w:eastAsia="ko-KR"/>
+        </w:rPr>
+      </w:pPr>
+      <w:r>
+        <w:rPr>
+          <w:b/>
+          <w:bCs/>
+          <w:lang w:eastAsia="ko-KR"/>
+        </w:rPr>
+        <w:t>Execution Structure</w:t>
+      </w:r>
+      <w:r>
+        <w:rPr>
+          <w:lang w:eastAsia="ko-KR"/>
+        </w:rPr>
+        <w:t xml:space="preserve">: The main function in main.cpp is structured with a </w:t>
+      </w:r>
+      <w:proofErr w:type="gramStart"/>
+      <w:r>
+        <w:rPr>
+          <w:lang w:eastAsia="ko-KR"/>
+        </w:rPr>
+        <w:t>for</w:t>
+      </w:r>
+      <w:proofErr w:type="gramEnd"/>
+      <w:r>
+        <w:rPr>
+          <w:lang w:eastAsia="ko-KR"/>
+        </w:rPr>
+        <w:t xml:space="preserve"> loop to sequentially process a total of four image files, from 1.jpg to 4.jpg. For each file, it performs the entire pipeline of image processing, feature extraction, and shape classification before printing the result to the console.</w:t>
       </w:r>
     </w:p>
     <w:p>
@@ -2458,7 +2630,6 @@
           <w:bCs/>
           <w:lang w:eastAsia="ko-KR"/>
         </w:rPr>
-        <w:lastRenderedPageBreak/>
         <w:t>C/C++ &gt; General &gt; Additional Include Directories</w:t>
       </w:r>
       <w:r>
@@ -2813,6 +2984,7 @@
       </w:pPr>
       <w:bookmarkStart w:id="9" w:name="_Toc211032650"/>
       <w:r>
+        <w:lastRenderedPageBreak/>
         <w:t>Time spent</w:t>
       </w:r>
       <w:bookmarkEnd w:id="9"/>
@@ -2976,7 +3148,6 @@
         <w:rPr>
           <w:lang w:eastAsia="ko-KR"/>
         </w:rPr>
-        <w:lastRenderedPageBreak/>
         <w:t xml:space="preserve">The most significant challenge was resolving issues related to linking the OpenCV library </w:t>
       </w:r>
       <w:proofErr w:type="gramStart"/>
@@ -3280,7 +3451,6 @@
         <w:rPr>
           <w:lang w:eastAsia="ko-KR"/>
         </w:rPr>
-        <w:lastRenderedPageBreak/>
         <w:t>GitHub</w:t>
       </w:r>
       <w:r>
@@ -3497,6 +3667,7 @@
           <w:b/>
           <w:bCs/>
         </w:rPr>
+        <w:lastRenderedPageBreak/>
         <w:t>Improved Algorithm Robustness</w:t>
       </w:r>
       <w:r>
@@ -5566,7 +5737,7 @@
         <w:sz w:val="20"/>
       </w:rPr>
     </w:lvl>
-    <w:lvl w:ilvl="1" w:tentative="1">
+    <w:lvl w:ilvl="1">
       <w:start w:val="1"/>
       <w:numFmt w:val="bullet"/>
       <w:lvlText w:val="o"/>
@@ -5696,6 +5867,155 @@
     </w:lvl>
   </w:abstractNum>
   <w:abstractNum w:abstractNumId="16" w15:restartNumberingAfterBreak="0">
+    <w:nsid w:val="6FA3222C"/>
+    <w:multiLevelType w:val="multilevel"/>
+    <w:tmpl w:val="38742314"/>
+    <w:lvl w:ilvl="0">
+      <w:start w:val="1"/>
+      <w:numFmt w:val="bullet"/>
+      <w:lvlText w:val=""/>
+      <w:lvlJc w:val="left"/>
+      <w:pPr>
+        <w:tabs>
+          <w:tab w:val="num" w:pos="720"/>
+        </w:tabs>
+        <w:ind w:left="720" w:hanging="360"/>
+      </w:pPr>
+      <w:rPr>
+        <w:rFonts w:ascii="Symbol" w:hAnsi="Symbol" w:hint="default"/>
+        <w:sz w:val="20"/>
+      </w:rPr>
+    </w:lvl>
+    <w:lvl w:ilvl="1" w:tentative="1">
+      <w:start w:val="1"/>
+      <w:numFmt w:val="bullet"/>
+      <w:lvlText w:val="o"/>
+      <w:lvlJc w:val="left"/>
+      <w:pPr>
+        <w:tabs>
+          <w:tab w:val="num" w:pos="1440"/>
+        </w:tabs>
+        <w:ind w:left="1440" w:hanging="360"/>
+      </w:pPr>
+      <w:rPr>
+        <w:rFonts w:ascii="Courier New" w:hAnsi="Courier New" w:hint="default"/>
+        <w:sz w:val="20"/>
+      </w:rPr>
+    </w:lvl>
+    <w:lvl w:ilvl="2" w:tentative="1">
+      <w:start w:val="1"/>
+      <w:numFmt w:val="bullet"/>
+      <w:lvlText w:val=""/>
+      <w:lvlJc w:val="left"/>
+      <w:pPr>
+        <w:tabs>
+          <w:tab w:val="num" w:pos="2160"/>
+        </w:tabs>
+        <w:ind w:left="2160" w:hanging="360"/>
+      </w:pPr>
+      <w:rPr>
+        <w:rFonts w:ascii="Wingdings" w:hAnsi="Wingdings" w:hint="default"/>
+        <w:sz w:val="20"/>
+      </w:rPr>
+    </w:lvl>
+    <w:lvl w:ilvl="3" w:tentative="1">
+      <w:start w:val="1"/>
+      <w:numFmt w:val="bullet"/>
+      <w:lvlText w:val=""/>
+      <w:lvlJc w:val="left"/>
+      <w:pPr>
+        <w:tabs>
+          <w:tab w:val="num" w:pos="2880"/>
+        </w:tabs>
+        <w:ind w:left="2880" w:hanging="360"/>
+      </w:pPr>
+      <w:rPr>
+        <w:rFonts w:ascii="Wingdings" w:hAnsi="Wingdings" w:hint="default"/>
+        <w:sz w:val="20"/>
+      </w:rPr>
+    </w:lvl>
+    <w:lvl w:ilvl="4" w:tentative="1">
+      <w:start w:val="1"/>
+      <w:numFmt w:val="bullet"/>
+      <w:lvlText w:val=""/>
+      <w:lvlJc w:val="left"/>
+      <w:pPr>
+        <w:tabs>
+          <w:tab w:val="num" w:pos="3600"/>
+        </w:tabs>
+        <w:ind w:left="3600" w:hanging="360"/>
+      </w:pPr>
+      <w:rPr>
+        <w:rFonts w:ascii="Wingdings" w:hAnsi="Wingdings" w:hint="default"/>
+        <w:sz w:val="20"/>
+      </w:rPr>
+    </w:lvl>
+    <w:lvl w:ilvl="5" w:tentative="1">
+      <w:start w:val="1"/>
+      <w:numFmt w:val="bullet"/>
+      <w:lvlText w:val=""/>
+      <w:lvlJc w:val="left"/>
+      <w:pPr>
+        <w:tabs>
+          <w:tab w:val="num" w:pos="4320"/>
+        </w:tabs>
+        <w:ind w:left="4320" w:hanging="360"/>
+      </w:pPr>
+      <w:rPr>
+        <w:rFonts w:ascii="Wingdings" w:hAnsi="Wingdings" w:hint="default"/>
+        <w:sz w:val="20"/>
+      </w:rPr>
+    </w:lvl>
+    <w:lvl w:ilvl="6" w:tentative="1">
+      <w:start w:val="1"/>
+      <w:numFmt w:val="bullet"/>
+      <w:lvlText w:val=""/>
+      <w:lvlJc w:val="left"/>
+      <w:pPr>
+        <w:tabs>
+          <w:tab w:val="num" w:pos="5040"/>
+        </w:tabs>
+        <w:ind w:left="5040" w:hanging="360"/>
+      </w:pPr>
+      <w:rPr>
+        <w:rFonts w:ascii="Wingdings" w:hAnsi="Wingdings" w:hint="default"/>
+        <w:sz w:val="20"/>
+      </w:rPr>
+    </w:lvl>
+    <w:lvl w:ilvl="7" w:tentative="1">
+      <w:start w:val="1"/>
+      <w:numFmt w:val="bullet"/>
+      <w:lvlText w:val=""/>
+      <w:lvlJc w:val="left"/>
+      <w:pPr>
+        <w:tabs>
+          <w:tab w:val="num" w:pos="5760"/>
+        </w:tabs>
+        <w:ind w:left="5760" w:hanging="360"/>
+      </w:pPr>
+      <w:rPr>
+        <w:rFonts w:ascii="Wingdings" w:hAnsi="Wingdings" w:hint="default"/>
+        <w:sz w:val="20"/>
+      </w:rPr>
+    </w:lvl>
+    <w:lvl w:ilvl="8" w:tentative="1">
+      <w:start w:val="1"/>
+      <w:numFmt w:val="bullet"/>
+      <w:lvlText w:val=""/>
+      <w:lvlJc w:val="left"/>
+      <w:pPr>
+        <w:tabs>
+          <w:tab w:val="num" w:pos="6480"/>
+        </w:tabs>
+        <w:ind w:left="6480" w:hanging="360"/>
+      </w:pPr>
+      <w:rPr>
+        <w:rFonts w:ascii="Wingdings" w:hAnsi="Wingdings" w:hint="default"/>
+        <w:sz w:val="20"/>
+      </w:rPr>
+    </w:lvl>
+  </w:abstractNum>
+  <w:abstractNum w:abstractNumId="17" w15:restartNumberingAfterBreak="0">
     <w:nsid w:val="7DA45936"/>
     <w:multiLevelType w:val="hybridMultilevel"/>
     <w:tmpl w:val="96E07EFC"/>
@@ -5809,7 +6129,7 @@
     <w:abstractNumId w:val="6"/>
   </w:num>
   <w:num w:numId="9" w16cid:durableId="697391651">
-    <w:abstractNumId w:val="16"/>
+    <w:abstractNumId w:val="17"/>
   </w:num>
   <w:num w:numId="10" w16cid:durableId="1392076842">
     <w:abstractNumId w:val="4"/>
@@ -5834,6 +6154,9 @@
   </w:num>
   <w:num w:numId="17" w16cid:durableId="300383147">
     <w:abstractNumId w:val="10"/>
+  </w:num>
+  <w:num w:numId="18" w16cid:durableId="204371579">
+    <w:abstractNumId w:val="16"/>
   </w:num>
 </w:numbering>
 </file>

</xml_diff>

<commit_message>
Update Doc files v1.2
</commit_message>
<xml_diff>
--- a/Doc/Doc_extra.docx
+++ b/Doc/Doc_extra.docx
@@ -226,7 +226,27 @@
               <w:szCs w:val="28"/>
               <w:lang w:eastAsia="ko-KR"/>
             </w:rPr>
-            <w:t xml:space="preserve">50251*66 </w:t>
+            <w:t>50251</w:t>
+          </w:r>
+          <w:r>
+            <w:rPr>
+              <w:rFonts w:hint="eastAsia"/>
+              <w:b/>
+              <w:bCs/>
+              <w:szCs w:val="28"/>
+              <w:lang w:eastAsia="ko-KR"/>
+            </w:rPr>
+            <w:t>5</w:t>
+          </w:r>
+          <w:r>
+            <w:rPr>
+              <w:rFonts w:hint="eastAsia"/>
+              <w:b/>
+              <w:bCs/>
+              <w:szCs w:val="28"/>
+              <w:lang w:eastAsia="ko-KR"/>
+            </w:rPr>
+            <w:t xml:space="preserve">66 </w:t>
           </w:r>
           <w:r>
             <w:rPr>
@@ -438,7 +458,7 @@
           <w:r>
             <w:fldChar w:fldCharType="separate"/>
           </w:r>
-          <w:hyperlink w:anchor="_Toc211032642" w:history="1">
+          <w:hyperlink w:anchor="_Toc211198203" w:history="1">
             <w:r>
               <w:rPr>
                 <w:rStyle w:val="ab"/>
@@ -465,7 +485,7 @@
                 <w:noProof/>
                 <w:webHidden/>
               </w:rPr>
-              <w:instrText xml:space="preserve"> PAGEREF _Toc211032642 \h </w:instrText>
+              <w:instrText xml:space="preserve"> PAGEREF _Toc211198203 \h </w:instrText>
             </w:r>
             <w:r>
               <w:rPr>
@@ -508,7 +528,7 @@
               <w:lang w:eastAsia="ko-KR"/>
             </w:rPr>
           </w:pPr>
-          <w:hyperlink w:anchor="_Toc211032643" w:history="1">
+          <w:hyperlink w:anchor="_Toc211198204" w:history="1">
             <w:r>
               <w:rPr>
                 <w:rStyle w:val="ab"/>
@@ -535,7 +555,7 @@
                 <w:noProof/>
                 <w:webHidden/>
               </w:rPr>
-              <w:instrText xml:space="preserve"> PAGEREF _Toc211032643 \h </w:instrText>
+              <w:instrText xml:space="preserve"> PAGEREF _Toc211198204 \h </w:instrText>
             </w:r>
             <w:r>
               <w:rPr>
@@ -578,7 +598,7 @@
               <w:lang w:eastAsia="ko-KR"/>
             </w:rPr>
           </w:pPr>
-          <w:hyperlink w:anchor="_Toc211032644" w:history="1">
+          <w:hyperlink w:anchor="_Toc211198205" w:history="1">
             <w:r>
               <w:rPr>
                 <w:rStyle w:val="ab"/>
@@ -605,7 +625,7 @@
                 <w:noProof/>
                 <w:webHidden/>
               </w:rPr>
-              <w:instrText xml:space="preserve"> PAGEREF _Toc211032644 \h </w:instrText>
+              <w:instrText xml:space="preserve"> PAGEREF _Toc211198205 \h </w:instrText>
             </w:r>
             <w:r>
               <w:rPr>
@@ -648,7 +668,7 @@
               <w:lang w:eastAsia="ko-KR"/>
             </w:rPr>
           </w:pPr>
-          <w:hyperlink w:anchor="_Toc211032645" w:history="1">
+          <w:hyperlink w:anchor="_Toc211198206" w:history="1">
             <w:r>
               <w:rPr>
                 <w:rStyle w:val="ab"/>
@@ -675,7 +695,7 @@
                 <w:noProof/>
                 <w:webHidden/>
               </w:rPr>
-              <w:instrText xml:space="preserve"> PAGEREF _Toc211032645 \h </w:instrText>
+              <w:instrText xml:space="preserve"> PAGEREF _Toc211198206 \h </w:instrText>
             </w:r>
             <w:r>
               <w:rPr>
@@ -718,7 +738,7 @@
               <w:lang w:eastAsia="ko-KR"/>
             </w:rPr>
           </w:pPr>
-          <w:hyperlink w:anchor="_Toc211032646" w:history="1">
+          <w:hyperlink w:anchor="_Toc211198207" w:history="1">
             <w:r>
               <w:rPr>
                 <w:rStyle w:val="ab"/>
@@ -745,7 +765,7 @@
                 <w:noProof/>
                 <w:webHidden/>
               </w:rPr>
-              <w:instrText xml:space="preserve"> PAGEREF _Toc211032646 \h </w:instrText>
+              <w:instrText xml:space="preserve"> PAGEREF _Toc211198207 \h </w:instrText>
             </w:r>
             <w:r>
               <w:rPr>
@@ -788,7 +808,7 @@
               <w:lang w:eastAsia="ko-KR"/>
             </w:rPr>
           </w:pPr>
-          <w:hyperlink w:anchor="_Toc211032647" w:history="1">
+          <w:hyperlink w:anchor="_Toc211198208" w:history="1">
             <w:r>
               <w:rPr>
                 <w:rStyle w:val="ab"/>
@@ -815,7 +835,7 @@
                 <w:noProof/>
                 <w:webHidden/>
               </w:rPr>
-              <w:instrText xml:space="preserve"> PAGEREF _Toc211032647 \h </w:instrText>
+              <w:instrText xml:space="preserve"> PAGEREF _Toc211198208 \h </w:instrText>
             </w:r>
             <w:r>
               <w:rPr>
@@ -858,7 +878,7 @@
               <w:lang w:eastAsia="ko-KR"/>
             </w:rPr>
           </w:pPr>
-          <w:hyperlink w:anchor="_Toc211032648" w:history="1">
+          <w:hyperlink w:anchor="_Toc211198209" w:history="1">
             <w:r>
               <w:rPr>
                 <w:rStyle w:val="ab"/>
@@ -885,7 +905,7 @@
                 <w:noProof/>
                 <w:webHidden/>
               </w:rPr>
-              <w:instrText xml:space="preserve"> PAGEREF _Toc211032648 \h </w:instrText>
+              <w:instrText xml:space="preserve"> PAGEREF _Toc211198209 \h </w:instrText>
             </w:r>
             <w:r>
               <w:rPr>
@@ -928,7 +948,7 @@
               <w:lang w:eastAsia="ko-KR"/>
             </w:rPr>
           </w:pPr>
-          <w:hyperlink w:anchor="_Toc211032649" w:history="1">
+          <w:hyperlink w:anchor="_Toc211198210" w:history="1">
             <w:r>
               <w:rPr>
                 <w:rStyle w:val="ab"/>
@@ -956,7 +976,7 @@
                 <w:noProof/>
                 <w:webHidden/>
               </w:rPr>
-              <w:instrText xml:space="preserve"> PAGEREF _Toc211032649 \h </w:instrText>
+              <w:instrText xml:space="preserve"> PAGEREF _Toc211198210 \h </w:instrText>
             </w:r>
             <w:r>
               <w:rPr>
@@ -999,7 +1019,7 @@
               <w:lang w:eastAsia="ko-KR"/>
             </w:rPr>
           </w:pPr>
-          <w:hyperlink w:anchor="_Toc211032650" w:history="1">
+          <w:hyperlink w:anchor="_Toc211198211" w:history="1">
             <w:r>
               <w:rPr>
                 <w:rStyle w:val="ab"/>
@@ -1026,7 +1046,7 @@
                 <w:noProof/>
                 <w:webHidden/>
               </w:rPr>
-              <w:instrText xml:space="preserve"> PAGEREF _Toc211032650 \h </w:instrText>
+              <w:instrText xml:space="preserve"> PAGEREF _Toc211198211 \h </w:instrText>
             </w:r>
             <w:r>
               <w:rPr>
@@ -1069,7 +1089,7 @@
               <w:lang w:eastAsia="ko-KR"/>
             </w:rPr>
           </w:pPr>
-          <w:hyperlink w:anchor="_Toc211032651" w:history="1">
+          <w:hyperlink w:anchor="_Toc211198212" w:history="1">
             <w:r>
               <w:rPr>
                 <w:rStyle w:val="ab"/>
@@ -1096,7 +1116,7 @@
                 <w:noProof/>
                 <w:webHidden/>
               </w:rPr>
-              <w:instrText xml:space="preserve"> PAGEREF _Toc211032651 \h </w:instrText>
+              <w:instrText xml:space="preserve"> PAGEREF _Toc211198212 \h </w:instrText>
             </w:r>
             <w:r>
               <w:rPr>
@@ -1139,7 +1159,7 @@
               <w:lang w:eastAsia="ko-KR"/>
             </w:rPr>
           </w:pPr>
-          <w:hyperlink w:anchor="_Toc211032652" w:history="1">
+          <w:hyperlink w:anchor="_Toc211198213" w:history="1">
             <w:r>
               <w:rPr>
                 <w:rStyle w:val="ab"/>
@@ -1149,6 +1169,14 @@
             </w:r>
             <w:r>
               <w:rPr>
+                <w:rStyle w:val="ab"/>
+                <w:noProof/>
+                <w:lang w:eastAsia="ko-KR"/>
+              </w:rPr>
+              <w:t xml:space="preserve"> &amp; Initial Development</w:t>
+            </w:r>
+            <w:r>
+              <w:rPr>
                 <w:noProof/>
                 <w:webHidden/>
               </w:rPr>
@@ -1166,7 +1194,7 @@
                 <w:noProof/>
                 <w:webHidden/>
               </w:rPr>
-              <w:instrText xml:space="preserve"> PAGEREF _Toc211032652 \h </w:instrText>
+              <w:instrText xml:space="preserve"> PAGEREF _Toc211198213 \h </w:instrText>
             </w:r>
             <w:r>
               <w:rPr>
@@ -1209,13 +1237,13 @@
               <w:lang w:eastAsia="ko-KR"/>
             </w:rPr>
           </w:pPr>
-          <w:hyperlink w:anchor="_Toc211032653" w:history="1">
+          <w:hyperlink w:anchor="_Toc211198214" w:history="1">
             <w:r>
               <w:rPr>
                 <w:rStyle w:val="ab"/>
                 <w:noProof/>
               </w:rPr>
-              <w:t>Meeting 2 – Review &amp; Integration</w:t>
+              <w:t>Meeting 2 – Windows Testing &amp; Problem Resolution</w:t>
             </w:r>
             <w:r>
               <w:rPr>
@@ -1236,7 +1264,7 @@
                 <w:noProof/>
                 <w:webHidden/>
               </w:rPr>
-              <w:instrText xml:space="preserve"> PAGEREF _Toc211032653 \h </w:instrText>
+              <w:instrText xml:space="preserve"> PAGEREF _Toc211198214 \h </w:instrText>
             </w:r>
             <w:r>
               <w:rPr>
@@ -1256,7 +1284,7 @@
                 <w:noProof/>
                 <w:webHidden/>
               </w:rPr>
-              <w:t>5</w:t>
+              <w:t>6</w:t>
             </w:r>
             <w:r>
               <w:rPr>
@@ -1279,7 +1307,7 @@
               <w:lang w:eastAsia="ko-KR"/>
             </w:rPr>
           </w:pPr>
-          <w:hyperlink w:anchor="_Toc211032654" w:history="1">
+          <w:hyperlink w:anchor="_Toc211198215" w:history="1">
             <w:r>
               <w:rPr>
                 <w:rStyle w:val="ab"/>
@@ -1306,7 +1334,7 @@
                 <w:noProof/>
                 <w:webHidden/>
               </w:rPr>
-              <w:instrText xml:space="preserve"> PAGEREF _Toc211032654 \h </w:instrText>
+              <w:instrText xml:space="preserve"> PAGEREF _Toc211198215 \h </w:instrText>
             </w:r>
             <w:r>
               <w:rPr>
@@ -1326,7 +1354,7 @@
                 <w:noProof/>
                 <w:webHidden/>
               </w:rPr>
-              <w:t>5</w:t>
+              <w:t>6</w:t>
             </w:r>
             <w:r>
               <w:rPr>
@@ -1349,7 +1377,7 @@
               <w:lang w:eastAsia="ko-KR"/>
             </w:rPr>
           </w:pPr>
-          <w:hyperlink w:anchor="_Toc211032655" w:history="1">
+          <w:hyperlink w:anchor="_Toc211198216" w:history="1">
             <w:r>
               <w:rPr>
                 <w:rStyle w:val="ab"/>
@@ -1377,7 +1405,7 @@
                 <w:noProof/>
                 <w:webHidden/>
               </w:rPr>
-              <w:instrText xml:space="preserve"> PAGEREF _Toc211032655 \h </w:instrText>
+              <w:instrText xml:space="preserve"> PAGEREF _Toc211198216 \h </w:instrText>
             </w:r>
             <w:r>
               <w:rPr>
@@ -1397,7 +1425,7 @@
                 <w:noProof/>
                 <w:webHidden/>
               </w:rPr>
-              <w:t>6</w:t>
+              <w:t>8</w:t>
             </w:r>
             <w:r>
               <w:rPr>
@@ -1420,7 +1448,7 @@
               <w:lang w:eastAsia="ko-KR"/>
             </w:rPr>
           </w:pPr>
-          <w:hyperlink w:anchor="_Toc211032656" w:history="1">
+          <w:hyperlink w:anchor="_Toc211198217" w:history="1">
             <w:r>
               <w:rPr>
                 <w:rStyle w:val="ab"/>
@@ -1447,7 +1475,7 @@
                 <w:noProof/>
                 <w:webHidden/>
               </w:rPr>
-              <w:instrText xml:space="preserve"> PAGEREF _Toc211032656 \h </w:instrText>
+              <w:instrText xml:space="preserve"> PAGEREF _Toc211198217 \h </w:instrText>
             </w:r>
             <w:r>
               <w:rPr>
@@ -1467,7 +1495,7 @@
                 <w:noProof/>
                 <w:webHidden/>
               </w:rPr>
-              <w:t>6</w:t>
+              <w:t>8</w:t>
             </w:r>
             <w:r>
               <w:rPr>
@@ -1490,7 +1518,7 @@
               <w:lang w:eastAsia="ko-KR"/>
             </w:rPr>
           </w:pPr>
-          <w:hyperlink w:anchor="_Toc211032657" w:history="1">
+          <w:hyperlink w:anchor="_Toc211198218" w:history="1">
             <w:r>
               <w:rPr>
                 <w:rStyle w:val="ab"/>
@@ -1517,7 +1545,7 @@
                 <w:noProof/>
                 <w:webHidden/>
               </w:rPr>
-              <w:instrText xml:space="preserve"> PAGEREF _Toc211032657 \h </w:instrText>
+              <w:instrText xml:space="preserve"> PAGEREF _Toc211198218 \h </w:instrText>
             </w:r>
             <w:r>
               <w:rPr>
@@ -1537,7 +1565,7 @@
                 <w:noProof/>
                 <w:webHidden/>
               </w:rPr>
-              <w:t>6</w:t>
+              <w:t>8</w:t>
             </w:r>
             <w:r>
               <w:rPr>
@@ -1560,7 +1588,7 @@
               <w:lang w:eastAsia="ko-KR"/>
             </w:rPr>
           </w:pPr>
-          <w:hyperlink w:anchor="_Toc211032658" w:history="1">
+          <w:hyperlink w:anchor="_Toc211198219" w:history="1">
             <w:r>
               <w:rPr>
                 <w:rStyle w:val="ab"/>
@@ -1587,7 +1615,7 @@
                 <w:noProof/>
                 <w:webHidden/>
               </w:rPr>
-              <w:instrText xml:space="preserve"> PAGEREF _Toc211032658 \h </w:instrText>
+              <w:instrText xml:space="preserve"> PAGEREF _Toc211198219 \h </w:instrText>
             </w:r>
             <w:r>
               <w:rPr>
@@ -1607,7 +1635,7 @@
                 <w:noProof/>
                 <w:webHidden/>
               </w:rPr>
-              <w:t>6</w:t>
+              <w:t>9</w:t>
             </w:r>
             <w:r>
               <w:rPr>
@@ -1707,7 +1735,7 @@
         <w:jc w:val="both"/>
       </w:pPr>
       <w:bookmarkStart w:id="0" w:name="_Hlk198644379"/>
-      <w:bookmarkStart w:id="1" w:name="_Toc211032642"/>
+      <w:bookmarkStart w:id="1" w:name="_Toc211198203"/>
       <w:bookmarkEnd w:id="0"/>
       <w:r>
         <w:lastRenderedPageBreak/>
@@ -1720,7 +1748,7 @@
         <w:pStyle w:val="2"/>
         <w:jc w:val="both"/>
       </w:pPr>
-      <w:bookmarkStart w:id="2" w:name="_Toc211032643"/>
+      <w:bookmarkStart w:id="2" w:name="_Toc211198204"/>
       <w:r>
         <w:t>Purpose</w:t>
       </w:r>
@@ -1747,7 +1775,7 @@
         <w:pStyle w:val="2"/>
         <w:jc w:val="both"/>
       </w:pPr>
-      <w:bookmarkStart w:id="3" w:name="_Toc211032644"/>
+      <w:bookmarkStart w:id="3" w:name="_Toc211198205"/>
       <w:r>
         <w:t>Functionality Overview</w:t>
       </w:r>
@@ -1935,7 +1963,7 @@
         <w:pStyle w:val="1"/>
         <w:jc w:val="both"/>
       </w:pPr>
-      <w:bookmarkStart w:id="4" w:name="_Toc211032645"/>
+      <w:bookmarkStart w:id="4" w:name="_Toc211198206"/>
       <w:r>
         <w:t>Design of Program</w:t>
       </w:r>
@@ -1946,7 +1974,7 @@
         <w:pStyle w:val="2"/>
         <w:jc w:val="both"/>
       </w:pPr>
-      <w:bookmarkStart w:id="5" w:name="_Toc211032646"/>
+      <w:bookmarkStart w:id="5" w:name="_Toc211198207"/>
       <w:r>
         <w:t>High-Level Design</w:t>
       </w:r>
@@ -2192,11 +2220,19 @@
         <w:pStyle w:val="2"/>
         <w:jc w:val="both"/>
       </w:pPr>
-      <w:bookmarkStart w:id="6" w:name="_Toc211032647"/>
+      <w:bookmarkStart w:id="6" w:name="_Toc211198208"/>
       <w:r>
         <w:t>Flow Diagram</w:t>
       </w:r>
       <w:bookmarkEnd w:id="6"/>
+    </w:p>
+    <w:p>
+      <w:pPr>
+        <w:rPr>
+          <w:rFonts w:hint="eastAsia"/>
+          <w:lang w:eastAsia="ko-KR"/>
+        </w:rPr>
+      </w:pPr>
     </w:p>
     <w:p>
       <w:pPr>
@@ -2261,10 +2297,19 @@
     </w:p>
     <w:p>
       <w:pPr>
+        <w:jc w:val="center"/>
+        <w:rPr>
+          <w:rFonts w:hint="eastAsia"/>
+          <w:lang w:eastAsia="ko-KR"/>
+        </w:rPr>
+      </w:pPr>
+    </w:p>
+    <w:p>
+      <w:pPr>
         <w:pStyle w:val="2"/>
         <w:jc w:val="both"/>
       </w:pPr>
-      <w:bookmarkStart w:id="7" w:name="_Toc211032648"/>
+      <w:bookmarkStart w:id="7" w:name="_Toc211198209"/>
       <w:r>
         <w:t>Implementation Notes</w:t>
       </w:r>
@@ -2426,6 +2471,7 @@
           <w:bCs/>
           <w:lang w:eastAsia="ko-KR"/>
         </w:rPr>
+        <w:lastRenderedPageBreak/>
         <w:t>Contour Extraction (</w:t>
       </w:r>
       <w:proofErr w:type="spellStart"/>
@@ -2457,7 +2503,6 @@
         <w:rPr>
           <w:lang w:eastAsia="ko-KR"/>
         </w:rPr>
-        <w:lastRenderedPageBreak/>
         <w:t>searching</w:t>
       </w:r>
       <w:proofErr w:type="gramEnd"/>
@@ -2515,7 +2560,7 @@
           <w:lang w:eastAsia="ko-KR"/>
         </w:rPr>
       </w:pPr>
-      <w:bookmarkStart w:id="8" w:name="_Toc211032649"/>
+      <w:bookmarkStart w:id="8" w:name="_Toc211198210"/>
       <w:r>
         <w:rPr>
           <w:rFonts w:hint="eastAsia"/>
@@ -2893,28 +2938,30 @@
         <w:rPr>
           <w:b/>
           <w:bCs/>
-          <w:lang w:eastAsia="ko-KR"/>
-        </w:rPr>
-        <w:t>Release</w:t>
-      </w:r>
-      <w:r>
-        <w:rPr>
-          <w:lang w:eastAsia="ko-KR"/>
-        </w:rPr>
-        <w:t xml:space="preserve"> and the platform to </w:t>
+        </w:rPr>
+        <w:t>Debug</w:t>
+      </w:r>
+      <w:r>
+        <w:t xml:space="preserve"> or </w:t>
       </w:r>
       <w:r>
         <w:rPr>
           <w:b/>
           <w:bCs/>
-          <w:lang w:eastAsia="ko-KR"/>
+        </w:rPr>
+        <w:t>Release</w:t>
+      </w:r>
+      <w:r>
+        <w:t xml:space="preserve"> and the platform to </w:t>
+      </w:r>
+      <w:r>
+        <w:rPr>
+          <w:b/>
+          <w:bCs/>
         </w:rPr>
         <w:t>x64</w:t>
       </w:r>
       <w:r>
-        <w:rPr>
-          <w:lang w:eastAsia="ko-KR"/>
-        </w:rPr>
         <w:t>.</w:t>
       </w:r>
     </w:p>
@@ -2932,6 +2979,7 @@
         <w:rPr>
           <w:lang w:eastAsia="ko-KR"/>
         </w:rPr>
+        <w:lastRenderedPageBreak/>
         <w:t xml:space="preserve">Press </w:t>
       </w:r>
       <w:r>
@@ -2976,510 +3024,21 @@
         </w:rPr>
         <w:t xml:space="preserve"> the console window.</w:t>
       </w:r>
-    </w:p>
-    <w:p>
-      <w:pPr>
-        <w:pStyle w:val="1"/>
-        <w:jc w:val="both"/>
-      </w:pPr>
-      <w:bookmarkStart w:id="9" w:name="_Toc211032650"/>
-      <w:r>
-        <w:lastRenderedPageBreak/>
-        <w:t>Time spent</w:t>
-      </w:r>
-      <w:bookmarkEnd w:id="9"/>
-    </w:p>
-    <w:p>
-      <w:pPr>
-        <w:rPr>
-          <w:lang w:eastAsia="ko-KR"/>
-        </w:rPr>
-      </w:pPr>
-      <w:r>
-        <w:rPr>
-          <w:b/>
-          <w:bCs/>
-          <w:lang w:eastAsia="ko-KR"/>
-        </w:rPr>
-        <w:t>Planning &amp; Design</w:t>
-      </w:r>
-      <w:r>
-        <w:rPr>
-          <w:lang w:eastAsia="ko-KR"/>
-        </w:rPr>
-        <w:t>: ~1 hour</w:t>
-      </w:r>
-    </w:p>
-    <w:p>
-      <w:pPr>
-        <w:rPr>
-          <w:lang w:eastAsia="ko-KR"/>
-        </w:rPr>
-      </w:pPr>
-      <w:r>
-        <w:rPr>
-          <w:b/>
-          <w:bCs/>
-          <w:lang w:eastAsia="ko-KR"/>
-        </w:rPr>
-        <w:t>Core Algorithm Implementation (Contour Finding, Feature Calculation)</w:t>
-      </w:r>
-      <w:r>
-        <w:rPr>
-          <w:lang w:eastAsia="ko-KR"/>
-        </w:rPr>
-        <w:t>: ~3 hours</w:t>
-      </w:r>
-    </w:p>
-    <w:p>
-      <w:pPr>
-        <w:rPr>
-          <w:lang w:eastAsia="ko-KR"/>
-        </w:rPr>
-      </w:pPr>
-      <w:r>
-        <w:rPr>
-          <w:b/>
-          <w:bCs/>
-          <w:lang w:eastAsia="ko-KR"/>
-        </w:rPr>
-        <w:t>Visual Studio Environment Setup &amp; Debugging</w:t>
-      </w:r>
-      <w:r>
-        <w:rPr>
-          <w:lang w:eastAsia="ko-KR"/>
-        </w:rPr>
-        <w:t>: ~2 hours</w:t>
-      </w:r>
-    </w:p>
-    <w:p>
-      <w:pPr>
-        <w:rPr>
-          <w:lang w:eastAsia="ko-KR"/>
-        </w:rPr>
-      </w:pPr>
-      <w:r>
-        <w:rPr>
-          <w:b/>
-          <w:bCs/>
-          <w:lang w:eastAsia="ko-KR"/>
-        </w:rPr>
-        <w:t>Report Writing &amp; Finalization</w:t>
-      </w:r>
-      <w:r>
-        <w:rPr>
-          <w:lang w:eastAsia="ko-KR"/>
-        </w:rPr>
-        <w:t>: ~1 hour</w:t>
-      </w:r>
-    </w:p>
-    <w:p>
-      <w:pPr>
-        <w:rPr>
-          <w:lang w:eastAsia="ko-KR"/>
-        </w:rPr>
-      </w:pPr>
-      <w:r>
-        <w:rPr>
-          <w:lang w:eastAsia="ko-KR"/>
+      <w:r>
+        <w:rPr>
+          <w:noProof/>
         </w:rPr>
         <w:t xml:space="preserve"> </w:t>
       </w:r>
       <w:r>
         <w:rPr>
-          <w:b/>
-          <w:bCs/>
-          <w:lang w:eastAsia="ko-KR"/>
-        </w:rPr>
-        <w:t>Total Estimated Time</w:t>
-      </w:r>
-      <w:r>
-        <w:rPr>
-          <w:lang w:eastAsia="ko-KR"/>
-        </w:rPr>
-        <w:t>: ~7 hours</w:t>
-      </w:r>
-    </w:p>
-    <w:p>
-      <w:pPr>
-        <w:pStyle w:val="1"/>
-        <w:jc w:val="both"/>
-      </w:pPr>
-      <w:bookmarkStart w:id="10" w:name="_Toc211032651"/>
-      <w:r>
-        <w:t>Process of Project and Record of Project Meetings</w:t>
-      </w:r>
-      <w:bookmarkEnd w:id="10"/>
-    </w:p>
-    <w:p>
-      <w:pPr>
-        <w:rPr>
-          <w:lang w:eastAsia="ko-KR"/>
-        </w:rPr>
-      </w:pPr>
-      <w:r>
-        <w:rPr>
-          <w:lang w:eastAsia="ko-KR"/>
-        </w:rPr>
-        <w:t xml:space="preserve">This extra project was undertaken separately from the main team project. The initial logic was developed in a macOS environment. The </w:t>
-      </w:r>
-      <w:proofErr w:type="gramStart"/>
-      <w:r>
-        <w:rPr>
-          <w:lang w:eastAsia="ko-KR"/>
-        </w:rPr>
-        <w:t>main focus</w:t>
-      </w:r>
-      <w:proofErr w:type="gramEnd"/>
-      <w:r>
-        <w:rPr>
-          <w:lang w:eastAsia="ko-KR"/>
-        </w:rPr>
-        <w:t xml:space="preserve"> of the work then shifted to porting the code to a Windows environment to run in Visual Studio.</w:t>
-      </w:r>
-    </w:p>
-    <w:p>
-      <w:pPr>
-        <w:rPr>
-          <w:lang w:eastAsia="ko-KR"/>
-        </w:rPr>
-      </w:pPr>
-      <w:r>
-        <w:rPr>
-          <w:lang w:eastAsia="ko-KR"/>
-        </w:rPr>
-        <w:t xml:space="preserve">The most significant challenge was resolving issues related to linking the OpenCV library </w:t>
-      </w:r>
-      <w:proofErr w:type="gramStart"/>
-      <w:r>
-        <w:rPr>
-          <w:lang w:eastAsia="ko-KR"/>
-        </w:rPr>
-        <w:t>in</w:t>
-      </w:r>
-      <w:proofErr w:type="gramEnd"/>
-      <w:r>
-        <w:rPr>
-          <w:lang w:eastAsia="ko-KR"/>
-        </w:rPr>
-        <w:t xml:space="preserve"> Visual Studio. Persistent errors related to the inability to load image files arose from incorrect path settings, linker dependencies, and library incompatibilities between Debug and Release modes. After attempting various solutions, including absolute path testing and modifying runtime library settings, the program was finally made to run successfully in </w:t>
-      </w:r>
-      <w:r>
-        <w:rPr>
-          <w:b/>
-          <w:bCs/>
-          <w:lang w:eastAsia="ko-KR"/>
-        </w:rPr>
-        <w:t>Release mode</w:t>
-      </w:r>
-      <w:r>
-        <w:rPr>
-          <w:lang w:eastAsia="ko-KR"/>
-        </w:rPr>
-        <w:t>.</w:t>
-      </w:r>
-    </w:p>
-    <w:p>
-      <w:pPr>
-        <w:rPr>
-          <w:color w:val="EE0000"/>
-          <w:sz w:val="44"/>
-          <w:szCs w:val="44"/>
-          <w:lang w:eastAsia="ko-KR"/>
-        </w:rPr>
-      </w:pPr>
-      <w:r>
-        <w:rPr>
-          <w:rFonts w:hint="eastAsia"/>
-          <w:color w:val="EE0000"/>
-          <w:sz w:val="44"/>
-          <w:szCs w:val="44"/>
-          <w:lang w:eastAsia="ko-KR"/>
-        </w:rPr>
-        <w:t xml:space="preserve">need to </w:t>
-      </w:r>
-      <w:r>
-        <w:rPr>
-          <w:rFonts w:hint="eastAsia"/>
-          <w:color w:val="EE0000"/>
-          <w:sz w:val="44"/>
-          <w:szCs w:val="44"/>
-          <w:lang w:eastAsia="ko-KR"/>
-        </w:rPr>
-        <w:t>change below</w:t>
-      </w:r>
-    </w:p>
-    <w:p>
-      <w:pPr>
-        <w:pStyle w:val="2"/>
-        <w:jc w:val="both"/>
-      </w:pPr>
-      <w:bookmarkStart w:id="11" w:name="_Toc211032652"/>
-      <w:r>
-        <w:t>Meeting 1 – Project Kickoff</w:t>
-      </w:r>
-      <w:bookmarkEnd w:id="11"/>
-    </w:p>
-    <w:p>
-      <w:pPr>
-        <w:pStyle w:val="a6"/>
-        <w:numPr>
-          <w:ilvl w:val="0"/>
-          <w:numId w:val="4"/>
-        </w:numPr>
-        <w:jc w:val="both"/>
-      </w:pPr>
-      <w:r>
-        <w:t>Discussed project requirements</w:t>
-      </w:r>
-    </w:p>
-    <w:p>
-      <w:pPr>
-        <w:pStyle w:val="a6"/>
-        <w:numPr>
-          <w:ilvl w:val="0"/>
-          <w:numId w:val="4"/>
-        </w:numPr>
-        <w:jc w:val="both"/>
-      </w:pPr>
-      <w:r>
-        <w:t>Assigned tasks: one team member focused on the composite function</w:t>
-      </w:r>
-      <w:r>
-        <w:t>, the other one on the clamping</w:t>
-      </w:r>
-    </w:p>
-    <w:p>
-      <w:pPr>
-        <w:pStyle w:val="a6"/>
-        <w:numPr>
-          <w:ilvl w:val="0"/>
-          <w:numId w:val="4"/>
-        </w:numPr>
-        <w:jc w:val="both"/>
-      </w:pPr>
-      <w:r>
-        <w:t>Duration: ~30 minutes</w:t>
-      </w:r>
-    </w:p>
-    <w:p>
-      <w:pPr>
-        <w:pStyle w:val="2"/>
-        <w:jc w:val="both"/>
-      </w:pPr>
-      <w:bookmarkStart w:id="12" w:name="_Toc211032653"/>
-      <w:r>
-        <w:t>Meeting 2 – Review &amp; Integration</w:t>
-      </w:r>
-      <w:bookmarkEnd w:id="12"/>
-    </w:p>
-    <w:p>
-      <w:pPr>
-        <w:pStyle w:val="a6"/>
-        <w:numPr>
-          <w:ilvl w:val="0"/>
-          <w:numId w:val="5"/>
-        </w:numPr>
-        <w:jc w:val="both"/>
-      </w:pPr>
-      <w:r>
-        <w:t>Shared individual implementations</w:t>
-      </w:r>
-    </w:p>
-    <w:p>
-      <w:pPr>
-        <w:pStyle w:val="a6"/>
-        <w:numPr>
-          <w:ilvl w:val="0"/>
-          <w:numId w:val="5"/>
-        </w:numPr>
-        <w:jc w:val="both"/>
-      </w:pPr>
-      <w:r>
-        <w:t>Tested composite function with sample images</w:t>
-      </w:r>
-    </w:p>
-    <w:p>
-      <w:pPr>
-        <w:pStyle w:val="a6"/>
-        <w:numPr>
-          <w:ilvl w:val="0"/>
-          <w:numId w:val="5"/>
-        </w:numPr>
-        <w:jc w:val="both"/>
-      </w:pPr>
-      <w:r>
-        <w:t>Adjusted clamping logic to handle edge cases</w:t>
-      </w:r>
-    </w:p>
-    <w:p>
-      <w:pPr>
-        <w:pStyle w:val="a6"/>
-        <w:numPr>
-          <w:ilvl w:val="0"/>
-          <w:numId w:val="5"/>
-        </w:numPr>
-        <w:jc w:val="both"/>
-      </w:pPr>
-      <w:r>
-        <w:t>Duration: ~30 minutes</w:t>
-      </w:r>
-    </w:p>
-    <w:p>
-      <w:pPr>
-        <w:pStyle w:val="2"/>
-        <w:jc w:val="both"/>
-      </w:pPr>
-      <w:bookmarkStart w:id="13" w:name="_Toc211032654"/>
-      <w:r>
-        <w:t>Records</w:t>
-      </w:r>
-      <w:bookmarkEnd w:id="13"/>
-    </w:p>
-    <w:p>
-      <w:pPr>
-        <w:pStyle w:val="a6"/>
-        <w:numPr>
-          <w:ilvl w:val="0"/>
-          <w:numId w:val="6"/>
-        </w:numPr>
-        <w:jc w:val="both"/>
-      </w:pPr>
-      <w:r>
-        <w:t>TODO: KakaoTalk screenshots</w:t>
-      </w:r>
-    </w:p>
-    <w:p>
-      <w:pPr>
-        <w:pStyle w:val="a6"/>
-        <w:numPr>
-          <w:ilvl w:val="0"/>
-          <w:numId w:val="6"/>
-        </w:numPr>
-        <w:jc w:val="both"/>
-      </w:pPr>
-      <w:r>
-        <w:t>Example: discussion on how to handle overflow/underflow</w:t>
-      </w:r>
-    </w:p>
-    <w:p>
-      <w:pPr>
-        <w:pStyle w:val="a6"/>
-        <w:numPr>
-          <w:ilvl w:val="0"/>
-          <w:numId w:val="9"/>
-        </w:numPr>
-        <w:jc w:val="both"/>
-      </w:pPr>
-      <w:r>
-        <w:rPr>
-          <w:rFonts w:hint="eastAsia"/>
-          <w:lang w:eastAsia="ko-KR"/>
-        </w:rPr>
-        <w:t>Adjusting schedule</w:t>
-      </w:r>
-    </w:p>
-    <w:p>
-      <w:pPr>
-        <w:pStyle w:val="a6"/>
-        <w:jc w:val="both"/>
-      </w:pPr>
-    </w:p>
-    <w:p>
-      <w:pPr>
-        <w:pStyle w:val="a6"/>
-        <w:numPr>
-          <w:ilvl w:val="0"/>
-          <w:numId w:val="9"/>
-        </w:numPr>
-        <w:jc w:val="both"/>
-      </w:pPr>
-      <w:r>
-        <w:rPr>
-          <w:noProof/>
-        </w:rPr>
-        <w:t xml:space="preserve"> </w:t>
-      </w:r>
-      <w:r>
-        <w:rPr>
-          <w:rFonts w:hint="eastAsia"/>
-          <w:noProof/>
-          <w:lang w:eastAsia="ko-KR"/>
-        </w:rPr>
-        <w:t>Discussing how to share the code</w:t>
-      </w:r>
-    </w:p>
-    <w:p>
-      <w:pPr>
-        <w:ind w:leftChars="300" w:left="720"/>
-        <w:jc w:val="both"/>
-        <w:rPr>
-          <w:lang w:eastAsia="ko-KR"/>
-        </w:rPr>
-      </w:pPr>
-    </w:p>
-    <w:p>
-      <w:pPr>
-        <w:pStyle w:val="a6"/>
-        <w:numPr>
-          <w:ilvl w:val="0"/>
-          <w:numId w:val="9"/>
-        </w:numPr>
-        <w:jc w:val="both"/>
-        <w:rPr>
-          <w:lang w:eastAsia="ko-KR"/>
-        </w:rPr>
-      </w:pPr>
-      <w:r>
-        <w:rPr>
-          <w:rFonts w:hint="eastAsia"/>
-          <w:lang w:eastAsia="ko-KR"/>
-        </w:rPr>
-        <w:t>Next step</w:t>
-      </w:r>
-    </w:p>
-    <w:p>
-      <w:pPr>
-        <w:pStyle w:val="2"/>
-        <w:jc w:val="both"/>
-        <w:rPr>
-          <w:lang w:eastAsia="ko-KR"/>
-        </w:rPr>
-      </w:pPr>
-      <w:bookmarkStart w:id="14" w:name="_Toc211032655"/>
-      <w:r>
-        <w:rPr>
-          <w:lang w:eastAsia="ko-KR"/>
-        </w:rPr>
-        <w:t>GitHub</w:t>
-      </w:r>
-      <w:r>
-        <w:rPr>
-          <w:rFonts w:hint="eastAsia"/>
-          <w:lang w:eastAsia="ko-KR"/>
-        </w:rPr>
-        <w:t xml:space="preserve"> records</w:t>
-      </w:r>
-      <w:bookmarkEnd w:id="14"/>
-    </w:p>
-    <w:p>
-      <w:pPr>
-        <w:ind w:left="360"/>
-        <w:jc w:val="both"/>
-        <w:rPr>
-          <w:lang w:eastAsia="ko-KR"/>
-        </w:rPr>
-      </w:pPr>
-      <w:r>
-        <w:rPr>
-          <w:noProof/>
           <w:lang w:eastAsia="ko-KR"/>
         </w:rPr>
         <w:drawing>
-          <wp:inline distT="0" distB="0" distL="0" distR="0" wp14:anchorId="7B4A7BAE" wp14:editId="42419612">
-            <wp:extent cx="5168348" cy="2356276"/>
-            <wp:effectExtent l="0" t="0" r="0" b="6350"/>
-            <wp:docPr id="1320335147" name="그림 1" descr="텍스트, 스크린샷, 소프트웨어, 멀티미디어 소프트웨어이(가) 표시된 사진&#10;&#10;AI 생성 콘텐츠는 정확하지 않을 수 있습니다."/>
+          <wp:inline distT="0" distB="0" distL="0" distR="0" wp14:anchorId="263EBD34" wp14:editId="1E4FAF9E">
+            <wp:extent cx="5200153" cy="1041644"/>
+            <wp:effectExtent l="0" t="0" r="635" b="6350"/>
+            <wp:docPr id="486948704" name="그림 1" descr="텍스트, 폰트, 스크린샷이(가) 표시된 사진&#10;&#10;AI 생성 콘텐츠는 정확하지 않을 수 있습니다."/>
             <wp:cNvGraphicFramePr>
               <a:graphicFrameLocks xmlns:a="http://schemas.openxmlformats.org/drawingml/2006/main" noChangeAspect="1"/>
             </wp:cNvGraphicFramePr>
@@ -3487,7 +3046,7 @@
               <a:graphicData uri="http://schemas.openxmlformats.org/drawingml/2006/picture">
                 <pic:pic xmlns:pic="http://schemas.openxmlformats.org/drawingml/2006/picture">
                   <pic:nvPicPr>
-                    <pic:cNvPr id="1320335147" name="그림 1" descr="텍스트, 스크린샷, 소프트웨어, 멀티미디어 소프트웨어이(가) 표시된 사진&#10;&#10;AI 생성 콘텐츠는 정확하지 않을 수 있습니다."/>
+                    <pic:cNvPr id="486948704" name="그림 1" descr="텍스트, 폰트, 스크린샷이(가) 표시된 사진&#10;&#10;AI 생성 콘텐츠는 정확하지 않을 수 있습니다."/>
                     <pic:cNvPicPr/>
                   </pic:nvPicPr>
                   <pic:blipFill>
@@ -3499,7 +3058,7 @@
                   <pic:spPr>
                     <a:xfrm>
                       <a:off x="0" y="0"/>
-                      <a:ext cx="5203798" cy="2372438"/>
+                      <a:ext cx="5216766" cy="1044972"/>
                     </a:xfrm>
                     <a:prstGeom prst="rect">
                       <a:avLst/>
@@ -3514,30 +3073,975 @@
     </w:p>
     <w:p>
       <w:pPr>
+        <w:pStyle w:val="1"/>
+        <w:jc w:val="both"/>
+      </w:pPr>
+      <w:bookmarkStart w:id="9" w:name="_Toc211198211"/>
+      <w:r>
+        <w:t>Time spent</w:t>
+      </w:r>
+      <w:bookmarkEnd w:id="9"/>
+    </w:p>
+    <w:p>
+      <w:pPr>
+        <w:rPr>
+          <w:lang w:eastAsia="ko-KR"/>
+        </w:rPr>
+      </w:pPr>
+      <w:r>
+        <w:rPr>
+          <w:b/>
+          <w:bCs/>
+          <w:lang w:eastAsia="ko-KR"/>
+        </w:rPr>
+        <w:t>Planning &amp; Design</w:t>
+      </w:r>
+      <w:r>
+        <w:rPr>
+          <w:lang w:eastAsia="ko-KR"/>
+        </w:rPr>
+        <w:t>: ~1 hour</w:t>
+      </w:r>
+    </w:p>
+    <w:p>
+      <w:pPr>
+        <w:rPr>
+          <w:lang w:eastAsia="ko-KR"/>
+        </w:rPr>
+      </w:pPr>
+      <w:r>
+        <w:rPr>
+          <w:b/>
+          <w:bCs/>
+          <w:lang w:eastAsia="ko-KR"/>
+        </w:rPr>
+        <w:t>Core Algorithm Implementation (Contour Finding, Feature Calculation)</w:t>
+      </w:r>
+      <w:r>
+        <w:rPr>
+          <w:lang w:eastAsia="ko-KR"/>
+        </w:rPr>
+        <w:t>: ~</w:t>
+      </w:r>
+      <w:r>
+        <w:rPr>
+          <w:rFonts w:hint="eastAsia"/>
+          <w:lang w:eastAsia="ko-KR"/>
+        </w:rPr>
+        <w:t>3</w:t>
+      </w:r>
+      <w:r>
+        <w:rPr>
+          <w:lang w:eastAsia="ko-KR"/>
+        </w:rPr>
+        <w:t xml:space="preserve"> hours</w:t>
+      </w:r>
+    </w:p>
+    <w:p>
+      <w:pPr>
+        <w:rPr>
+          <w:lang w:eastAsia="ko-KR"/>
+        </w:rPr>
+      </w:pPr>
+      <w:r>
+        <w:rPr>
+          <w:b/>
+          <w:bCs/>
+          <w:lang w:eastAsia="ko-KR"/>
+        </w:rPr>
+        <w:t>Visual Studio Environment Setup &amp; Debugging</w:t>
+      </w:r>
+      <w:r>
+        <w:rPr>
+          <w:lang w:eastAsia="ko-KR"/>
+        </w:rPr>
+        <w:t>: ~2 hours</w:t>
+      </w:r>
+    </w:p>
+    <w:p>
+      <w:pPr>
+        <w:rPr>
+          <w:lang w:eastAsia="ko-KR"/>
+        </w:rPr>
+      </w:pPr>
+      <w:r>
+        <w:rPr>
+          <w:b/>
+          <w:bCs/>
+          <w:lang w:eastAsia="ko-KR"/>
+        </w:rPr>
+        <w:t>Report Writing &amp; Finalization</w:t>
+      </w:r>
+      <w:r>
+        <w:rPr>
+          <w:lang w:eastAsia="ko-KR"/>
+        </w:rPr>
+        <w:t>: ~</w:t>
+      </w:r>
+      <w:r>
+        <w:rPr>
+          <w:rFonts w:hint="eastAsia"/>
+          <w:lang w:eastAsia="ko-KR"/>
+        </w:rPr>
+        <w:t>2</w:t>
+      </w:r>
+      <w:r>
+        <w:rPr>
+          <w:lang w:eastAsia="ko-KR"/>
+        </w:rPr>
+        <w:t xml:space="preserve"> </w:t>
+      </w:r>
+      <w:proofErr w:type="gramStart"/>
+      <w:r>
+        <w:rPr>
+          <w:lang w:eastAsia="ko-KR"/>
+        </w:rPr>
+        <w:t>hour</w:t>
+      </w:r>
+      <w:proofErr w:type="gramEnd"/>
+    </w:p>
+    <w:p>
+      <w:pPr>
+        <w:rPr>
+          <w:lang w:eastAsia="ko-KR"/>
+        </w:rPr>
+      </w:pPr>
+      <w:r>
+        <w:rPr>
+          <w:lang w:eastAsia="ko-KR"/>
+        </w:rPr>
+        <w:t xml:space="preserve"> </w:t>
+      </w:r>
+      <w:r>
+        <w:rPr>
+          <w:b/>
+          <w:bCs/>
+          <w:lang w:eastAsia="ko-KR"/>
+        </w:rPr>
+        <w:t>Total Estimated Time</w:t>
+      </w:r>
+      <w:r>
+        <w:rPr>
+          <w:lang w:eastAsia="ko-KR"/>
+        </w:rPr>
+        <w:t>: ~</w:t>
+      </w:r>
+      <w:r>
+        <w:rPr>
+          <w:rFonts w:hint="eastAsia"/>
+          <w:lang w:eastAsia="ko-KR"/>
+        </w:rPr>
+        <w:t>8</w:t>
+      </w:r>
+      <w:r>
+        <w:rPr>
+          <w:lang w:eastAsia="ko-KR"/>
+        </w:rPr>
+        <w:t xml:space="preserve"> hours</w:t>
+      </w:r>
+    </w:p>
+    <w:p>
+      <w:pPr>
+        <w:pStyle w:val="1"/>
+        <w:jc w:val="both"/>
+      </w:pPr>
+      <w:bookmarkStart w:id="10" w:name="_Toc211198212"/>
+      <w:r>
+        <w:t>Process of Project and Record of Project Meetings</w:t>
+      </w:r>
+      <w:bookmarkEnd w:id="10"/>
+    </w:p>
+    <w:p>
+      <w:pPr>
+        <w:rPr>
+          <w:lang w:eastAsia="ko-KR"/>
+        </w:rPr>
+      </w:pPr>
+      <w:r>
+        <w:rPr>
+          <w:lang w:eastAsia="ko-KR"/>
+        </w:rPr>
+        <w:t>This extra project was undertaken separately from the main team project. The initial logic was developed in a macOS environment, with subsequent efforts focused on porting the code to a Windows environment to run in Visual Studio.</w:t>
+      </w:r>
+    </w:p>
+    <w:p>
+      <w:pPr>
+        <w:rPr>
+          <w:lang w:eastAsia="ko-KR"/>
+        </w:rPr>
+      </w:pPr>
+      <w:r>
+        <w:rPr>
+          <w:lang w:eastAsia="ko-KR"/>
+        </w:rPr>
+        <w:t xml:space="preserve">The most significant challenge was resolving issues related to linking the OpenCV library. Persistent errors related to the inability to load image files arose from incorrect path settings, linker dependencies, and library version mismatches. Through a systematic debugging process, the root cause was identified as an </w:t>
+      </w:r>
+      <w:r>
+        <w:rPr>
+          <w:b/>
+          <w:bCs/>
+          <w:lang w:eastAsia="ko-KR"/>
+        </w:rPr>
+        <w:t>error in the OpenCV library's linker settings</w:t>
+      </w:r>
+      <w:r>
+        <w:rPr>
+          <w:lang w:eastAsia="ko-KR"/>
+        </w:rPr>
+        <w:t xml:space="preserve">. After correcting this configuration, the program was confirmed to </w:t>
+      </w:r>
+      <w:r>
+        <w:rPr>
+          <w:b/>
+          <w:bCs/>
+          <w:lang w:eastAsia="ko-KR"/>
+        </w:rPr>
+        <w:t>operate stably in both Debug and Release modes</w:t>
+      </w:r>
+      <w:r>
+        <w:rPr>
+          <w:lang w:eastAsia="ko-KR"/>
+        </w:rPr>
+        <w:t>, resolving all initial execution issues.</w:t>
+      </w:r>
+    </w:p>
+    <w:p>
+      <w:pPr>
+        <w:rPr>
+          <w:lang w:eastAsia="ko-KR"/>
+        </w:rPr>
+      </w:pPr>
+    </w:p>
+    <w:p>
+      <w:pPr>
+        <w:rPr>
+          <w:rFonts w:hint="eastAsia"/>
+          <w:lang w:eastAsia="ko-KR"/>
+        </w:rPr>
+      </w:pPr>
+    </w:p>
+    <w:p>
+      <w:pPr>
+        <w:pStyle w:val="2"/>
+        <w:jc w:val="both"/>
+        <w:rPr>
+          <w:rFonts w:hint="eastAsia"/>
+          <w:lang w:eastAsia="ko-KR"/>
+        </w:rPr>
+      </w:pPr>
+      <w:bookmarkStart w:id="11" w:name="_Toc211198213"/>
+      <w:r>
+        <w:t>Meeting 1 – Project Kickoff</w:t>
+      </w:r>
+      <w:r>
+        <w:rPr>
+          <w:rFonts w:hint="eastAsia"/>
+          <w:lang w:eastAsia="ko-KR"/>
+        </w:rPr>
+        <w:t xml:space="preserve"> &amp; Initial Development</w:t>
+      </w:r>
+      <w:bookmarkEnd w:id="11"/>
+    </w:p>
+    <w:p>
+      <w:pPr>
+        <w:pStyle w:val="a6"/>
+        <w:numPr>
+          <w:ilvl w:val="0"/>
+          <w:numId w:val="4"/>
+        </w:numPr>
+        <w:jc w:val="both"/>
+      </w:pPr>
+      <w:r>
+        <w:rPr>
+          <w:b/>
+          <w:bCs/>
+        </w:rPr>
+        <w:t>Discussion:</w:t>
+      </w:r>
+    </w:p>
+    <w:p>
+      <w:pPr>
+        <w:pStyle w:val="a6"/>
+        <w:numPr>
+          <w:ilvl w:val="1"/>
+          <w:numId w:val="4"/>
+        </w:numPr>
+        <w:jc w:val="both"/>
+      </w:pPr>
+      <w:r>
+        <w:t>Briefly discussed plans for the extra project after class.</w:t>
+      </w:r>
+    </w:p>
+    <w:p>
+      <w:pPr>
+        <w:pStyle w:val="a6"/>
+        <w:numPr>
+          <w:ilvl w:val="1"/>
+          <w:numId w:val="4"/>
+        </w:numPr>
+        <w:jc w:val="both"/>
+      </w:pPr>
+      <w:proofErr w:type="gramStart"/>
+      <w:r>
+        <w:t>Decided</w:t>
+      </w:r>
+      <w:proofErr w:type="gramEnd"/>
+      <w:r>
+        <w:t xml:space="preserve"> to use GitHub as </w:t>
+      </w:r>
+      <w:proofErr w:type="gramStart"/>
+      <w:r>
+        <w:t>the</w:t>
+      </w:r>
+      <w:proofErr w:type="gramEnd"/>
+      <w:r>
+        <w:t xml:space="preserve"> collaboration platform.</w:t>
+      </w:r>
+    </w:p>
+    <w:p>
+      <w:pPr>
+        <w:pStyle w:val="a6"/>
+        <w:numPr>
+          <w:ilvl w:val="1"/>
+          <w:numId w:val="4"/>
+        </w:numPr>
+        <w:jc w:val="both"/>
+      </w:pPr>
+      <w:r>
+        <w:t>Assigned roles: One member would implement the initial algorithm while the other would handle testing and debugging.</w:t>
+      </w:r>
+    </w:p>
+    <w:p>
+      <w:pPr>
+        <w:pStyle w:val="a6"/>
+        <w:numPr>
+          <w:ilvl w:val="0"/>
+          <w:numId w:val="4"/>
+        </w:numPr>
+        <w:jc w:val="both"/>
+      </w:pPr>
+      <w:r>
+        <w:rPr>
+          <w:b/>
+          <w:bCs/>
+        </w:rPr>
+        <w:lastRenderedPageBreak/>
+        <w:t>Outcome:</w:t>
+      </w:r>
+    </w:p>
+    <w:p>
+      <w:pPr>
+        <w:pStyle w:val="a6"/>
+        <w:numPr>
+          <w:ilvl w:val="1"/>
+          <w:numId w:val="4"/>
+        </w:numPr>
+        <w:jc w:val="both"/>
+        <w:rPr>
+          <w:rFonts w:hint="eastAsia"/>
+        </w:rPr>
+      </w:pPr>
+      <w:r>
+        <w:t xml:space="preserve">The initial version of the code, which implemented image loading and basic algorithms using OpenCV on macOS, was shared on the </w:t>
+      </w:r>
+      <w:proofErr w:type="spellStart"/>
+      <w:r>
+        <w:t>extra_demo</w:t>
+      </w:r>
+      <w:proofErr w:type="spellEnd"/>
+      <w:r>
+        <w:t xml:space="preserve"> branch</w:t>
+      </w:r>
+      <w:r>
+        <w:rPr>
+          <w:rFonts w:hint="eastAsia"/>
+          <w:lang w:eastAsia="ko-KR"/>
+        </w:rPr>
+        <w:t>.</w:t>
+      </w:r>
+    </w:p>
+    <w:p>
+      <w:pPr>
+        <w:pStyle w:val="2"/>
+        <w:jc w:val="both"/>
+      </w:pPr>
+      <w:bookmarkStart w:id="12" w:name="_Toc211198214"/>
+      <w:r>
+        <w:t xml:space="preserve">Meeting 2 – </w:t>
+      </w:r>
+      <w:r>
+        <w:t>Windows Testing &amp; Problem Resolution</w:t>
+      </w:r>
+      <w:bookmarkEnd w:id="12"/>
+    </w:p>
+    <w:p>
+      <w:pPr>
+        <w:pStyle w:val="a6"/>
+        <w:numPr>
+          <w:ilvl w:val="0"/>
+          <w:numId w:val="5"/>
+        </w:numPr>
+        <w:jc w:val="both"/>
+      </w:pPr>
+      <w:r>
+        <w:rPr>
+          <w:b/>
+          <w:bCs/>
+        </w:rPr>
+        <w:t>Discussion:</w:t>
+      </w:r>
+    </w:p>
+    <w:p>
+      <w:pPr>
+        <w:pStyle w:val="a6"/>
+        <w:numPr>
+          <w:ilvl w:val="1"/>
+          <w:numId w:val="5"/>
+        </w:numPr>
+        <w:jc w:val="both"/>
+      </w:pPr>
+      <w:r>
+        <w:t xml:space="preserve">Identified and shared a critical issue where the code failed to load image files in </w:t>
+      </w:r>
+      <w:r>
+        <w:rPr>
+          <w:b/>
+          <w:bCs/>
+        </w:rPr>
+        <w:t>Debug mode</w:t>
+      </w:r>
+      <w:r>
+        <w:t xml:space="preserve"> on Windows, although it worked correctly in </w:t>
+      </w:r>
+      <w:r>
+        <w:rPr>
+          <w:b/>
+          <w:bCs/>
+        </w:rPr>
+        <w:t>Release mode</w:t>
+      </w:r>
+      <w:r>
+        <w:t>.</w:t>
+      </w:r>
+    </w:p>
+    <w:p>
+      <w:pPr>
+        <w:pStyle w:val="a6"/>
+        <w:numPr>
+          <w:ilvl w:val="1"/>
+          <w:numId w:val="5"/>
+        </w:numPr>
+        <w:jc w:val="both"/>
+      </w:pPr>
+      <w:r>
+        <w:t xml:space="preserve">The problem was presumed to be with the </w:t>
+      </w:r>
+      <w:proofErr w:type="gramStart"/>
+      <w:r>
+        <w:t>cv::</w:t>
+      </w:r>
+      <w:proofErr w:type="spellStart"/>
+      <w:proofErr w:type="gramEnd"/>
+      <w:r>
+        <w:t>imread</w:t>
+      </w:r>
+      <w:proofErr w:type="spellEnd"/>
+      <w:r>
+        <w:t xml:space="preserve"> function. A solution was proposed to change the image loading method to read the file into a buffer and decode it with the </w:t>
+      </w:r>
+      <w:proofErr w:type="gramStart"/>
+      <w:r>
+        <w:t>cv::</w:t>
+      </w:r>
+      <w:proofErr w:type="spellStart"/>
+      <w:proofErr w:type="gramEnd"/>
+      <w:r>
+        <w:t>imdecode</w:t>
+      </w:r>
+      <w:proofErr w:type="spellEnd"/>
+      <w:r>
+        <w:t xml:space="preserve"> function.</w:t>
+      </w:r>
+    </w:p>
+    <w:p>
+      <w:pPr>
+        <w:pStyle w:val="a6"/>
+        <w:numPr>
+          <w:ilvl w:val="0"/>
+          <w:numId w:val="5"/>
+        </w:numPr>
+        <w:jc w:val="both"/>
+      </w:pPr>
+      <w:r>
+        <w:rPr>
+          <w:b/>
+          <w:bCs/>
+        </w:rPr>
+        <w:t>Outcome:</w:t>
+      </w:r>
+    </w:p>
+    <w:p>
+      <w:pPr>
+        <w:pStyle w:val="a6"/>
+        <w:numPr>
+          <w:ilvl w:val="1"/>
+          <w:numId w:val="5"/>
+        </w:numPr>
+        <w:jc w:val="both"/>
+      </w:pPr>
+      <w:r>
+        <w:t xml:space="preserve">The image loading logic was updated using </w:t>
+      </w:r>
+      <w:proofErr w:type="spellStart"/>
+      <w:r>
+        <w:t>imdecode</w:t>
+      </w:r>
+      <w:proofErr w:type="spellEnd"/>
+      <w:r>
+        <w:t xml:space="preserve">, and the revised code was pushed to the </w:t>
+      </w:r>
+      <w:proofErr w:type="spellStart"/>
+      <w:r>
+        <w:t>extra_final</w:t>
+      </w:r>
+      <w:proofErr w:type="spellEnd"/>
+      <w:r>
+        <w:t xml:space="preserve"> branch.</w:t>
+      </w:r>
+    </w:p>
+    <w:p>
+      <w:pPr>
+        <w:pStyle w:val="a6"/>
+        <w:numPr>
+          <w:ilvl w:val="1"/>
+          <w:numId w:val="5"/>
+        </w:numPr>
+        <w:jc w:val="both"/>
+        <w:rPr>
+          <w:rFonts w:hint="eastAsia"/>
+        </w:rPr>
+      </w:pPr>
+      <w:r>
+        <w:t>The updated code was confirmed to work stably in both Debug and Release modes.</w:t>
+      </w:r>
+    </w:p>
+    <w:p>
+      <w:pPr>
+        <w:pStyle w:val="2"/>
+        <w:jc w:val="both"/>
+        <w:rPr>
+          <w:rFonts w:hint="eastAsia"/>
+          <w:lang w:eastAsia="ko-KR"/>
+        </w:rPr>
+      </w:pPr>
+      <w:bookmarkStart w:id="13" w:name="_Toc211198215"/>
+      <w:r>
+        <w:t>Records</w:t>
+      </w:r>
+      <w:bookmarkEnd w:id="13"/>
+    </w:p>
+    <w:p>
+      <w:pPr>
+        <w:rPr>
+          <w:lang w:eastAsia="ko-KR"/>
+        </w:rPr>
+      </w:pPr>
+      <w:r>
+        <w:rPr>
+          <w:rFonts w:hint="eastAsia"/>
+          <w:noProof/>
+          <w:lang w:eastAsia="ko-KR"/>
+        </w:rPr>
+        <w:drawing>
+          <wp:inline distT="0" distB="0" distL="0" distR="0" wp14:anchorId="5C3BB7A0" wp14:editId="13B3F26E">
+            <wp:extent cx="4539833" cy="3466769"/>
+            <wp:effectExtent l="0" t="0" r="0" b="635"/>
+            <wp:docPr id="1063013864" name="그림 2"/>
+            <wp:cNvGraphicFramePr>
+              <a:graphicFrameLocks xmlns:a="http://schemas.openxmlformats.org/drawingml/2006/main" noChangeAspect="1"/>
+            </wp:cNvGraphicFramePr>
+            <a:graphic xmlns:a="http://schemas.openxmlformats.org/drawingml/2006/main">
+              <a:graphicData uri="http://schemas.openxmlformats.org/drawingml/2006/picture">
+                <pic:pic xmlns:pic="http://schemas.openxmlformats.org/drawingml/2006/picture">
+                  <pic:nvPicPr>
+                    <pic:cNvPr id="0" name="Picture 2"/>
+                    <pic:cNvPicPr>
+                      <a:picLocks noChangeAspect="1" noChangeArrowheads="1"/>
+                    </pic:cNvPicPr>
+                  </pic:nvPicPr>
+                  <pic:blipFill rotWithShape="1">
+                    <a:blip r:embed="rId12">
+                      <a:extLst>
+                        <a:ext uri="{28A0092B-C50C-407E-A947-70E740481C1C}">
+                          <a14:useLocalDpi xmlns:a14="http://schemas.microsoft.com/office/drawing/2010/main" val="0"/>
+                        </a:ext>
+                      </a:extLst>
+                    </a:blip>
+                    <a:srcRect b="60857"/>
+                    <a:stretch>
+                      <a:fillRect/>
+                    </a:stretch>
+                  </pic:blipFill>
+                  <pic:spPr bwMode="auto">
+                    <a:xfrm>
+                      <a:off x="0" y="0"/>
+                      <a:ext cx="4540250" cy="3467088"/>
+                    </a:xfrm>
+                    <a:prstGeom prst="rect">
+                      <a:avLst/>
+                    </a:prstGeom>
+                    <a:noFill/>
+                    <a:ln>
+                      <a:noFill/>
+                    </a:ln>
+                    <a:extLst>
+                      <a:ext uri="{53640926-AAD7-44D8-BBD7-CCE9431645EC}">
+                        <a14:shadowObscured xmlns:a14="http://schemas.microsoft.com/office/drawing/2010/main"/>
+                      </a:ext>
+                    </a:extLst>
+                  </pic:spPr>
+                </pic:pic>
+              </a:graphicData>
+            </a:graphic>
+          </wp:inline>
+        </w:drawing>
+      </w:r>
+    </w:p>
+    <w:p>
+      <w:pPr>
+        <w:rPr>
+          <w:lang w:eastAsia="ko-KR"/>
+        </w:rPr>
+      </w:pPr>
+      <w:r>
+        <w:rPr>
+          <w:noProof/>
+          <w:lang w:eastAsia="ko-KR"/>
+        </w:rPr>
+        <w:lastRenderedPageBreak/>
+        <w:drawing>
+          <wp:inline distT="0" distB="0" distL="0" distR="0" wp14:anchorId="3FF762C1" wp14:editId="0AB01385">
+            <wp:extent cx="4142630" cy="5078343"/>
+            <wp:effectExtent l="0" t="0" r="0" b="8255"/>
+            <wp:docPr id="2022366514" name="그림 3"/>
+            <wp:cNvGraphicFramePr>
+              <a:graphicFrameLocks xmlns:a="http://schemas.openxmlformats.org/drawingml/2006/main" noChangeAspect="1"/>
+            </wp:cNvGraphicFramePr>
+            <a:graphic xmlns:a="http://schemas.openxmlformats.org/drawingml/2006/main">
+              <a:graphicData uri="http://schemas.openxmlformats.org/drawingml/2006/picture">
+                <pic:pic xmlns:pic="http://schemas.openxmlformats.org/drawingml/2006/picture">
+                  <pic:nvPicPr>
+                    <pic:cNvPr id="0" name="Picture 3"/>
+                    <pic:cNvPicPr>
+                      <a:picLocks noChangeAspect="1" noChangeArrowheads="1"/>
+                    </pic:cNvPicPr>
+                  </pic:nvPicPr>
+                  <pic:blipFill rotWithShape="1">
+                    <a:blip r:embed="rId12" cstate="print">
+                      <a:extLst>
+                        <a:ext uri="{28A0092B-C50C-407E-A947-70E740481C1C}">
+                          <a14:useLocalDpi xmlns:a14="http://schemas.microsoft.com/office/drawing/2010/main" val="0"/>
+                        </a:ext>
+                      </a:extLst>
+                    </a:blip>
+                    <a:srcRect t="37164"/>
+                    <a:stretch>
+                      <a:fillRect/>
+                    </a:stretch>
+                  </pic:blipFill>
+                  <pic:spPr bwMode="auto">
+                    <a:xfrm>
+                      <a:off x="0" y="0"/>
+                      <a:ext cx="4158372" cy="5097641"/>
+                    </a:xfrm>
+                    <a:prstGeom prst="rect">
+                      <a:avLst/>
+                    </a:prstGeom>
+                    <a:noFill/>
+                    <a:ln>
+                      <a:noFill/>
+                    </a:ln>
+                    <a:extLst>
+                      <a:ext uri="{53640926-AAD7-44D8-BBD7-CCE9431645EC}">
+                        <a14:shadowObscured xmlns:a14="http://schemas.microsoft.com/office/drawing/2010/main"/>
+                      </a:ext>
+                    </a:extLst>
+                  </pic:spPr>
+                </pic:pic>
+              </a:graphicData>
+            </a:graphic>
+          </wp:inline>
+        </w:drawing>
+      </w:r>
+    </w:p>
+    <w:p>
+      <w:pPr>
+        <w:rPr>
+          <w:rFonts w:hint="eastAsia"/>
+          <w:lang w:eastAsia="ko-KR"/>
+        </w:rPr>
+      </w:pPr>
+      <w:r>
+        <w:rPr>
+          <w:noProof/>
+          <w:lang w:eastAsia="ko-KR"/>
+        </w:rPr>
+        <w:drawing>
+          <wp:inline distT="0" distB="0" distL="0" distR="0" wp14:anchorId="50CD00F9" wp14:editId="1046E446">
+            <wp:extent cx="4150581" cy="3543981"/>
+            <wp:effectExtent l="0" t="0" r="2540" b="0"/>
+            <wp:docPr id="1192252897" name="그림 4"/>
+            <wp:cNvGraphicFramePr>
+              <a:graphicFrameLocks xmlns:a="http://schemas.openxmlformats.org/drawingml/2006/main" noChangeAspect="1"/>
+            </wp:cNvGraphicFramePr>
+            <a:graphic xmlns:a="http://schemas.openxmlformats.org/drawingml/2006/main">
+              <a:graphicData uri="http://schemas.openxmlformats.org/drawingml/2006/picture">
+                <pic:pic xmlns:pic="http://schemas.openxmlformats.org/drawingml/2006/picture">
+                  <pic:nvPicPr>
+                    <pic:cNvPr id="0" name="Picture 4"/>
+                    <pic:cNvPicPr>
+                      <a:picLocks noChangeAspect="1" noChangeArrowheads="1"/>
+                    </pic:cNvPicPr>
+                  </pic:nvPicPr>
+                  <pic:blipFill rotWithShape="1">
+                    <a:blip r:embed="rId13" cstate="print">
+                      <a:extLst>
+                        <a:ext uri="{28A0092B-C50C-407E-A947-70E740481C1C}">
+                          <a14:useLocalDpi xmlns:a14="http://schemas.microsoft.com/office/drawing/2010/main" val="0"/>
+                        </a:ext>
+                      </a:extLst>
+                    </a:blip>
+                    <a:srcRect b="19110"/>
+                    <a:stretch>
+                      <a:fillRect/>
+                    </a:stretch>
+                  </pic:blipFill>
+                  <pic:spPr bwMode="auto">
+                    <a:xfrm>
+                      <a:off x="0" y="0"/>
+                      <a:ext cx="4162627" cy="3554266"/>
+                    </a:xfrm>
+                    <a:prstGeom prst="rect">
+                      <a:avLst/>
+                    </a:prstGeom>
+                    <a:noFill/>
+                    <a:ln>
+                      <a:noFill/>
+                    </a:ln>
+                    <a:extLst>
+                      <a:ext uri="{53640926-AAD7-44D8-BBD7-CCE9431645EC}">
+                        <a14:shadowObscured xmlns:a14="http://schemas.microsoft.com/office/drawing/2010/main"/>
+                      </a:ext>
+                    </a:extLst>
+                  </pic:spPr>
+                </pic:pic>
+              </a:graphicData>
+            </a:graphic>
+          </wp:inline>
+        </w:drawing>
+      </w:r>
+    </w:p>
+    <w:p>
+      <w:pPr>
+        <w:pStyle w:val="2"/>
+        <w:jc w:val="both"/>
+        <w:rPr>
+          <w:lang w:eastAsia="ko-KR"/>
+        </w:rPr>
+      </w:pPr>
+      <w:bookmarkStart w:id="14" w:name="_Toc211198216"/>
+      <w:r>
+        <w:rPr>
+          <w:lang w:eastAsia="ko-KR"/>
+        </w:rPr>
+        <w:lastRenderedPageBreak/>
+        <w:t>GitHub</w:t>
+      </w:r>
+      <w:r>
+        <w:rPr>
+          <w:rFonts w:hint="eastAsia"/>
+          <w:lang w:eastAsia="ko-KR"/>
+        </w:rPr>
+        <w:t xml:space="preserve"> records</w:t>
+      </w:r>
+      <w:bookmarkEnd w:id="14"/>
+    </w:p>
+    <w:p>
+      <w:pPr>
+        <w:rPr>
+          <w:rFonts w:hint="eastAsia"/>
+          <w:lang w:eastAsia="ko-KR"/>
+        </w:rPr>
+      </w:pPr>
+      <w:hyperlink r:id="rId14" w:history="1">
+        <w:r>
+          <w:rPr>
+            <w:rStyle w:val="ab"/>
+            <w:lang w:eastAsia="ko-KR"/>
+          </w:rPr>
+          <w:t>https://github.com/JuhwanLee99/TermProject01_DIP_Team15</w:t>
+        </w:r>
+      </w:hyperlink>
+    </w:p>
+    <w:p>
+      <w:pPr>
+        <w:pStyle w:val="a6"/>
+        <w:numPr>
+          <w:ilvl w:val="0"/>
+          <w:numId w:val="16"/>
+        </w:numPr>
+        <w:rPr>
+          <w:rFonts w:hint="eastAsia"/>
+          <w:lang w:eastAsia="ko-KR"/>
+        </w:rPr>
+      </w:pPr>
+      <w:r>
+        <w:rPr>
+          <w:rFonts w:hint="eastAsia"/>
+          <w:b/>
+          <w:bCs/>
+          <w:lang w:eastAsia="ko-KR"/>
+        </w:rPr>
+        <w:t>Initial branch with codes from macOS</w:t>
+      </w:r>
+    </w:p>
+    <w:p>
+      <w:pPr>
         <w:ind w:left="360"/>
         <w:jc w:val="both"/>
         <w:rPr>
-          <w:color w:val="EE0000"/>
-          <w:u w:val="single"/>
-          <w:lang w:eastAsia="ko-KR"/>
-        </w:rPr>
-      </w:pPr>
-      <w:r>
+          <w:lang w:eastAsia="ko-KR"/>
+        </w:rPr>
+      </w:pPr>
+      <w:r>
+        <w:rPr>
+          <w:lang w:eastAsia="ko-KR"/>
+        </w:rPr>
+        <w:drawing>
+          <wp:inline distT="0" distB="0" distL="0" distR="0" wp14:anchorId="2ED48468" wp14:editId="47C60AB0">
+            <wp:extent cx="5731510" cy="2748915"/>
+            <wp:effectExtent l="0" t="0" r="2540" b="0"/>
+            <wp:docPr id="1863880204" name="그림 1" descr="텍스트, 스크린샷, 소프트웨어, 멀티미디어 소프트웨어이(가) 표시된 사진&#10;&#10;AI 생성 콘텐츠는 정확하지 않을 수 있습니다."/>
+            <wp:cNvGraphicFramePr>
+              <a:graphicFrameLocks xmlns:a="http://schemas.openxmlformats.org/drawingml/2006/main" noChangeAspect="1"/>
+            </wp:cNvGraphicFramePr>
+            <a:graphic xmlns:a="http://schemas.openxmlformats.org/drawingml/2006/main">
+              <a:graphicData uri="http://schemas.openxmlformats.org/drawingml/2006/picture">
+                <pic:pic xmlns:pic="http://schemas.openxmlformats.org/drawingml/2006/picture">
+                  <pic:nvPicPr>
+                    <pic:cNvPr id="1863880204" name="그림 1" descr="텍스트, 스크린샷, 소프트웨어, 멀티미디어 소프트웨어이(가) 표시된 사진&#10;&#10;AI 생성 콘텐츠는 정확하지 않을 수 있습니다."/>
+                    <pic:cNvPicPr/>
+                  </pic:nvPicPr>
+                  <pic:blipFill>
+                    <a:blip r:embed="rId15"/>
+                    <a:stretch>
+                      <a:fillRect/>
+                    </a:stretch>
+                  </pic:blipFill>
+                  <pic:spPr>
+                    <a:xfrm>
+                      <a:off x="0" y="0"/>
+                      <a:ext cx="5731510" cy="2748915"/>
+                    </a:xfrm>
+                    <a:prstGeom prst="rect">
+                      <a:avLst/>
+                    </a:prstGeom>
+                  </pic:spPr>
+                </pic:pic>
+              </a:graphicData>
+            </a:graphic>
+          </wp:inline>
+        </w:drawing>
+      </w:r>
+    </w:p>
+    <w:p>
+      <w:pPr>
+        <w:pStyle w:val="a6"/>
+        <w:numPr>
+          <w:ilvl w:val="0"/>
+          <w:numId w:val="16"/>
+        </w:numPr>
         <w:rPr>
           <w:rFonts w:hint="eastAsia"/>
-          <w:color w:val="EE0000"/>
-          <w:u w:val="single"/>
-          <w:lang w:eastAsia="ko-KR"/>
-        </w:rPr>
-        <w:t xml:space="preserve">update the screenshot before </w:t>
-      </w:r>
-      <w:r>
-        <w:rPr>
-          <w:color w:val="EE0000"/>
-          <w:u w:val="single"/>
-          <w:lang w:eastAsia="ko-KR"/>
-        </w:rPr>
-        <w:t>submitting</w:t>
+          <w:lang w:eastAsia="ko-KR"/>
+        </w:rPr>
+      </w:pPr>
+      <w:r>
+        <w:rPr>
+          <w:rFonts w:hint="eastAsia"/>
+          <w:b/>
+          <w:bCs/>
+          <w:lang w:eastAsia="ko-KR"/>
+        </w:rPr>
+        <w:t>Final</w:t>
+      </w:r>
+      <w:r>
+        <w:rPr>
+          <w:rFonts w:hint="eastAsia"/>
+          <w:b/>
+          <w:bCs/>
+          <w:lang w:eastAsia="ko-KR"/>
+        </w:rPr>
+        <w:t xml:space="preserve"> branch with codes </w:t>
+      </w:r>
+      <w:r>
+        <w:rPr>
+          <w:rFonts w:hint="eastAsia"/>
+          <w:b/>
+          <w:bCs/>
+          <w:lang w:eastAsia="ko-KR"/>
+        </w:rPr>
+        <w:t>for Visual Studio, Windows</w:t>
+      </w:r>
+    </w:p>
+    <w:p>
+      <w:pPr>
+        <w:ind w:left="360"/>
+        <w:jc w:val="both"/>
+        <w:rPr>
+          <w:rFonts w:hint="eastAsia"/>
+          <w:lang w:eastAsia="ko-KR"/>
+        </w:rPr>
+      </w:pPr>
+      <w:r>
+        <w:rPr>
+          <w:lang w:eastAsia="ko-KR"/>
+        </w:rPr>
+        <w:drawing>
+          <wp:inline distT="0" distB="0" distL="0" distR="0" wp14:anchorId="1FF22839" wp14:editId="4CE00086">
+            <wp:extent cx="5731510" cy="2471420"/>
+            <wp:effectExtent l="0" t="0" r="2540" b="5080"/>
+            <wp:docPr id="1827577917" name="그림 1" descr="텍스트, 스크린샷, 소프트웨어, 멀티미디어 소프트웨어이(가) 표시된 사진&#10;&#10;AI 생성 콘텐츠는 정확하지 않을 수 있습니다."/>
+            <wp:cNvGraphicFramePr>
+              <a:graphicFrameLocks xmlns:a="http://schemas.openxmlformats.org/drawingml/2006/main" noChangeAspect="1"/>
+            </wp:cNvGraphicFramePr>
+            <a:graphic xmlns:a="http://schemas.openxmlformats.org/drawingml/2006/main">
+              <a:graphicData uri="http://schemas.openxmlformats.org/drawingml/2006/picture">
+                <pic:pic xmlns:pic="http://schemas.openxmlformats.org/drawingml/2006/picture">
+                  <pic:nvPicPr>
+                    <pic:cNvPr id="1827577917" name="그림 1" descr="텍스트, 스크린샷, 소프트웨어, 멀티미디어 소프트웨어이(가) 표시된 사진&#10;&#10;AI 생성 콘텐츠는 정확하지 않을 수 있습니다."/>
+                    <pic:cNvPicPr/>
+                  </pic:nvPicPr>
+                  <pic:blipFill>
+                    <a:blip r:embed="rId16"/>
+                    <a:stretch>
+                      <a:fillRect/>
+                    </a:stretch>
+                  </pic:blipFill>
+                  <pic:spPr>
+                    <a:xfrm>
+                      <a:off x="0" y="0"/>
+                      <a:ext cx="5731510" cy="2471420"/>
+                    </a:xfrm>
+                    <a:prstGeom prst="rect">
+                      <a:avLst/>
+                    </a:prstGeom>
+                  </pic:spPr>
+                </pic:pic>
+              </a:graphicData>
+            </a:graphic>
+          </wp:inline>
+        </w:drawing>
       </w:r>
     </w:p>
     <w:p>
@@ -3545,7 +4049,7 @@
         <w:pStyle w:val="1"/>
         <w:jc w:val="both"/>
       </w:pPr>
-      <w:bookmarkStart w:id="15" w:name="_Toc211032656"/>
+      <w:bookmarkStart w:id="15" w:name="_Toc211198217"/>
       <w:r>
         <w:t>Member's Thoughts on This Project</w:t>
       </w:r>
@@ -3556,7 +4060,7 @@
         <w:pStyle w:val="2"/>
         <w:jc w:val="both"/>
       </w:pPr>
-      <w:bookmarkStart w:id="16" w:name="_Toc211032657"/>
+      <w:bookmarkStart w:id="16" w:name="_Toc211198218"/>
       <w:r>
         <w:t>Lessons Learned</w:t>
       </w:r>
@@ -3599,7 +4103,11 @@
         <w:t>Understanding the Development Environment</w:t>
       </w:r>
       <w:r>
-        <w:t>: This project was an opportunity to experience the differences between operating systems and IDEs. It was a lesson in navigating the complexities of Visual Studio's project properties. The debugging process reinforced the importance of a systematic approach to problem-solving.</w:t>
+        <w:t xml:space="preserve">: This project was an opportunity to experience the differences between operating systems and IDEs. It was a </w:t>
+      </w:r>
+      <w:r>
+        <w:lastRenderedPageBreak/>
+        <w:t>lesson in navigating the complexities of Visual Studio's project properties. The debugging process reinforced the importance of a systematic approach to problem-solving.</w:t>
       </w:r>
     </w:p>
     <w:p>
@@ -3627,7 +4135,7 @@
         <w:pStyle w:val="2"/>
         <w:jc w:val="both"/>
       </w:pPr>
-      <w:bookmarkStart w:id="17" w:name="_Toc211032658"/>
+      <w:bookmarkStart w:id="17" w:name="_Toc211198219"/>
       <w:r>
         <w:t>Future Improvements</w:t>
       </w:r>
@@ -3667,7 +4175,6 @@
           <w:b/>
           <w:bCs/>
         </w:rPr>
-        <w:lastRenderedPageBreak/>
         <w:t>Improved Algorithm Robustness</w:t>
       </w:r>
       <w:r>
@@ -3695,12 +4202,12 @@
       </w:r>
     </w:p>
     <w:sectPr>
-      <w:headerReference w:type="even" r:id="rId12"/>
-      <w:headerReference w:type="default" r:id="rId13"/>
-      <w:footerReference w:type="even" r:id="rId14"/>
-      <w:footerReference w:type="default" r:id="rId15"/>
-      <w:headerReference w:type="first" r:id="rId16"/>
-      <w:footerReference w:type="first" r:id="rId17"/>
+      <w:headerReference w:type="even" r:id="rId17"/>
+      <w:headerReference w:type="default" r:id="rId18"/>
+      <w:footerReference w:type="even" r:id="rId19"/>
+      <w:footerReference w:type="default" r:id="rId20"/>
+      <w:headerReference w:type="first" r:id="rId21"/>
+      <w:footerReference w:type="first" r:id="rId22"/>
       <w:pgSz w:w="11906" w:h="16838"/>
       <w:pgMar w:top="1440" w:right="1440" w:bottom="1440" w:left="1440" w:header="708" w:footer="708" w:gutter="0"/>
       <w:pgNumType w:start="0"/>
@@ -4121,7 +4628,7 @@
         <w:rFonts w:ascii="Symbol" w:hAnsi="Symbol" w:hint="default"/>
       </w:rPr>
     </w:lvl>
-    <w:lvl w:ilvl="1" w:tplc="10000003" w:tentative="1">
+    <w:lvl w:ilvl="1" w:tplc="10000003">
       <w:start w:val="1"/>
       <w:numFmt w:val="bullet"/>
       <w:lvlText w:val="o"/>
@@ -4819,6 +5326,155 @@
     </w:lvl>
   </w:abstractNum>
   <w:abstractNum w:abstractNumId="8" w15:restartNumberingAfterBreak="0">
+    <w:nsid w:val="21242CC6"/>
+    <w:multiLevelType w:val="multilevel"/>
+    <w:tmpl w:val="E7B0F03C"/>
+    <w:lvl w:ilvl="0">
+      <w:start w:val="1"/>
+      <w:numFmt w:val="bullet"/>
+      <w:lvlText w:val=""/>
+      <w:lvlJc w:val="left"/>
+      <w:pPr>
+        <w:tabs>
+          <w:tab w:val="num" w:pos="720"/>
+        </w:tabs>
+        <w:ind w:left="720" w:hanging="360"/>
+      </w:pPr>
+      <w:rPr>
+        <w:rFonts w:ascii="Symbol" w:hAnsi="Symbol" w:hint="default"/>
+        <w:sz w:val="20"/>
+      </w:rPr>
+    </w:lvl>
+    <w:lvl w:ilvl="1" w:tentative="1">
+      <w:start w:val="1"/>
+      <w:numFmt w:val="bullet"/>
+      <w:lvlText w:val="o"/>
+      <w:lvlJc w:val="left"/>
+      <w:pPr>
+        <w:tabs>
+          <w:tab w:val="num" w:pos="1440"/>
+        </w:tabs>
+        <w:ind w:left="1440" w:hanging="360"/>
+      </w:pPr>
+      <w:rPr>
+        <w:rFonts w:ascii="Courier New" w:hAnsi="Courier New" w:hint="default"/>
+        <w:sz w:val="20"/>
+      </w:rPr>
+    </w:lvl>
+    <w:lvl w:ilvl="2" w:tentative="1">
+      <w:start w:val="1"/>
+      <w:numFmt w:val="bullet"/>
+      <w:lvlText w:val=""/>
+      <w:lvlJc w:val="left"/>
+      <w:pPr>
+        <w:tabs>
+          <w:tab w:val="num" w:pos="2160"/>
+        </w:tabs>
+        <w:ind w:left="2160" w:hanging="360"/>
+      </w:pPr>
+      <w:rPr>
+        <w:rFonts w:ascii="Wingdings" w:hAnsi="Wingdings" w:hint="default"/>
+        <w:sz w:val="20"/>
+      </w:rPr>
+    </w:lvl>
+    <w:lvl w:ilvl="3" w:tentative="1">
+      <w:start w:val="1"/>
+      <w:numFmt w:val="bullet"/>
+      <w:lvlText w:val=""/>
+      <w:lvlJc w:val="left"/>
+      <w:pPr>
+        <w:tabs>
+          <w:tab w:val="num" w:pos="2880"/>
+        </w:tabs>
+        <w:ind w:left="2880" w:hanging="360"/>
+      </w:pPr>
+      <w:rPr>
+        <w:rFonts w:ascii="Wingdings" w:hAnsi="Wingdings" w:hint="default"/>
+        <w:sz w:val="20"/>
+      </w:rPr>
+    </w:lvl>
+    <w:lvl w:ilvl="4" w:tentative="1">
+      <w:start w:val="1"/>
+      <w:numFmt w:val="bullet"/>
+      <w:lvlText w:val=""/>
+      <w:lvlJc w:val="left"/>
+      <w:pPr>
+        <w:tabs>
+          <w:tab w:val="num" w:pos="3600"/>
+        </w:tabs>
+        <w:ind w:left="3600" w:hanging="360"/>
+      </w:pPr>
+      <w:rPr>
+        <w:rFonts w:ascii="Wingdings" w:hAnsi="Wingdings" w:hint="default"/>
+        <w:sz w:val="20"/>
+      </w:rPr>
+    </w:lvl>
+    <w:lvl w:ilvl="5" w:tentative="1">
+      <w:start w:val="1"/>
+      <w:numFmt w:val="bullet"/>
+      <w:lvlText w:val=""/>
+      <w:lvlJc w:val="left"/>
+      <w:pPr>
+        <w:tabs>
+          <w:tab w:val="num" w:pos="4320"/>
+        </w:tabs>
+        <w:ind w:left="4320" w:hanging="360"/>
+      </w:pPr>
+      <w:rPr>
+        <w:rFonts w:ascii="Wingdings" w:hAnsi="Wingdings" w:hint="default"/>
+        <w:sz w:val="20"/>
+      </w:rPr>
+    </w:lvl>
+    <w:lvl w:ilvl="6" w:tentative="1">
+      <w:start w:val="1"/>
+      <w:numFmt w:val="bullet"/>
+      <w:lvlText w:val=""/>
+      <w:lvlJc w:val="left"/>
+      <w:pPr>
+        <w:tabs>
+          <w:tab w:val="num" w:pos="5040"/>
+        </w:tabs>
+        <w:ind w:left="5040" w:hanging="360"/>
+      </w:pPr>
+      <w:rPr>
+        <w:rFonts w:ascii="Wingdings" w:hAnsi="Wingdings" w:hint="default"/>
+        <w:sz w:val="20"/>
+      </w:rPr>
+    </w:lvl>
+    <w:lvl w:ilvl="7" w:tentative="1">
+      <w:start w:val="1"/>
+      <w:numFmt w:val="bullet"/>
+      <w:lvlText w:val=""/>
+      <w:lvlJc w:val="left"/>
+      <w:pPr>
+        <w:tabs>
+          <w:tab w:val="num" w:pos="5760"/>
+        </w:tabs>
+        <w:ind w:left="5760" w:hanging="360"/>
+      </w:pPr>
+      <w:rPr>
+        <w:rFonts w:ascii="Wingdings" w:hAnsi="Wingdings" w:hint="default"/>
+        <w:sz w:val="20"/>
+      </w:rPr>
+    </w:lvl>
+    <w:lvl w:ilvl="8" w:tentative="1">
+      <w:start w:val="1"/>
+      <w:numFmt w:val="bullet"/>
+      <w:lvlText w:val=""/>
+      <w:lvlJc w:val="left"/>
+      <w:pPr>
+        <w:tabs>
+          <w:tab w:val="num" w:pos="6480"/>
+        </w:tabs>
+        <w:ind w:left="6480" w:hanging="360"/>
+      </w:pPr>
+      <w:rPr>
+        <w:rFonts w:ascii="Wingdings" w:hAnsi="Wingdings" w:hint="default"/>
+        <w:sz w:val="20"/>
+      </w:rPr>
+    </w:lvl>
+  </w:abstractNum>
+  <w:abstractNum w:abstractNumId="9" w15:restartNumberingAfterBreak="0">
     <w:nsid w:val="25736134"/>
     <w:multiLevelType w:val="multilevel"/>
     <w:tmpl w:val="874A9756"/>
@@ -4931,10 +5587,10 @@
       </w:pPr>
     </w:lvl>
   </w:abstractNum>
-  <w:abstractNum w:abstractNumId="9" w15:restartNumberingAfterBreak="0">
+  <w:abstractNum w:abstractNumId="10" w15:restartNumberingAfterBreak="0">
     <w:nsid w:val="26B4028C"/>
     <w:multiLevelType w:val="multilevel"/>
-    <w:tmpl w:val="BCF80C36"/>
+    <w:tmpl w:val="8998298E"/>
     <w:lvl w:ilvl="0">
       <w:start w:val="1"/>
       <w:numFmt w:val="bullet"/>
@@ -4951,20 +5607,17 @@
         <w:sz w:val="20"/>
       </w:rPr>
     </w:lvl>
-    <w:lvl w:ilvl="1" w:tentative="1">
-      <w:start w:val="1"/>
-      <w:numFmt w:val="bullet"/>
-      <w:lvlText w:val="o"/>
-      <w:lvlJc w:val="left"/>
-      <w:pPr>
-        <w:tabs>
-          <w:tab w:val="num" w:pos="1440"/>
-        </w:tabs>
+    <w:lvl w:ilvl="1">
+      <w:start w:val="3"/>
+      <w:numFmt w:val="bullet"/>
+      <w:lvlText w:val=""/>
+      <w:lvlJc w:val="left"/>
+      <w:pPr>
         <w:ind w:left="1440" w:hanging="360"/>
       </w:pPr>
       <w:rPr>
-        <w:rFonts w:ascii="Courier New" w:hAnsi="Courier New" w:hint="default"/>
-        <w:sz w:val="20"/>
+        <w:rFonts w:ascii="Wingdings" w:eastAsiaTheme="minorEastAsia" w:hAnsi="Wingdings" w:cstheme="minorBidi" w:hint="default"/>
+        <w:b/>
       </w:rPr>
     </w:lvl>
     <w:lvl w:ilvl="2" w:tentative="1">
@@ -5080,7 +5733,120 @@
       </w:rPr>
     </w:lvl>
   </w:abstractNum>
-  <w:abstractNum w:abstractNumId="10" w15:restartNumberingAfterBreak="0">
+  <w:abstractNum w:abstractNumId="11" w15:restartNumberingAfterBreak="0">
+    <w:nsid w:val="320B05E7"/>
+    <w:multiLevelType w:val="hybridMultilevel"/>
+    <w:tmpl w:val="EF64762C"/>
+    <w:lvl w:ilvl="0" w:tplc="68CE1376">
+      <w:start w:val="3"/>
+      <w:numFmt w:val="bullet"/>
+      <w:lvlText w:val=""/>
+      <w:lvlJc w:val="left"/>
+      <w:pPr>
+        <w:ind w:left="800" w:hanging="360"/>
+      </w:pPr>
+      <w:rPr>
+        <w:rFonts w:ascii="Wingdings" w:eastAsiaTheme="minorEastAsia" w:hAnsi="Wingdings" w:cstheme="minorBidi" w:hint="default"/>
+      </w:rPr>
+    </w:lvl>
+    <w:lvl w:ilvl="1" w:tplc="04090003" w:tentative="1">
+      <w:start w:val="1"/>
+      <w:numFmt w:val="bullet"/>
+      <w:lvlText w:val=""/>
+      <w:lvlJc w:val="left"/>
+      <w:pPr>
+        <w:ind w:left="1320" w:hanging="440"/>
+      </w:pPr>
+      <w:rPr>
+        <w:rFonts w:ascii="Wingdings" w:hAnsi="Wingdings" w:hint="default"/>
+      </w:rPr>
+    </w:lvl>
+    <w:lvl w:ilvl="2" w:tplc="04090005" w:tentative="1">
+      <w:start w:val="1"/>
+      <w:numFmt w:val="bullet"/>
+      <w:lvlText w:val=""/>
+      <w:lvlJc w:val="left"/>
+      <w:pPr>
+        <w:ind w:left="1760" w:hanging="440"/>
+      </w:pPr>
+      <w:rPr>
+        <w:rFonts w:ascii="Wingdings" w:hAnsi="Wingdings" w:hint="default"/>
+      </w:rPr>
+    </w:lvl>
+    <w:lvl w:ilvl="3" w:tplc="04090001" w:tentative="1">
+      <w:start w:val="1"/>
+      <w:numFmt w:val="bullet"/>
+      <w:lvlText w:val=""/>
+      <w:lvlJc w:val="left"/>
+      <w:pPr>
+        <w:ind w:left="2200" w:hanging="440"/>
+      </w:pPr>
+      <w:rPr>
+        <w:rFonts w:ascii="Wingdings" w:hAnsi="Wingdings" w:hint="default"/>
+      </w:rPr>
+    </w:lvl>
+    <w:lvl w:ilvl="4" w:tplc="04090003" w:tentative="1">
+      <w:start w:val="1"/>
+      <w:numFmt w:val="bullet"/>
+      <w:lvlText w:val=""/>
+      <w:lvlJc w:val="left"/>
+      <w:pPr>
+        <w:ind w:left="2640" w:hanging="440"/>
+      </w:pPr>
+      <w:rPr>
+        <w:rFonts w:ascii="Wingdings" w:hAnsi="Wingdings" w:hint="default"/>
+      </w:rPr>
+    </w:lvl>
+    <w:lvl w:ilvl="5" w:tplc="04090005" w:tentative="1">
+      <w:start w:val="1"/>
+      <w:numFmt w:val="bullet"/>
+      <w:lvlText w:val=""/>
+      <w:lvlJc w:val="left"/>
+      <w:pPr>
+        <w:ind w:left="3080" w:hanging="440"/>
+      </w:pPr>
+      <w:rPr>
+        <w:rFonts w:ascii="Wingdings" w:hAnsi="Wingdings" w:hint="default"/>
+      </w:rPr>
+    </w:lvl>
+    <w:lvl w:ilvl="6" w:tplc="04090001" w:tentative="1">
+      <w:start w:val="1"/>
+      <w:numFmt w:val="bullet"/>
+      <w:lvlText w:val=""/>
+      <w:lvlJc w:val="left"/>
+      <w:pPr>
+        <w:ind w:left="3520" w:hanging="440"/>
+      </w:pPr>
+      <w:rPr>
+        <w:rFonts w:ascii="Wingdings" w:hAnsi="Wingdings" w:hint="default"/>
+      </w:rPr>
+    </w:lvl>
+    <w:lvl w:ilvl="7" w:tplc="04090003" w:tentative="1">
+      <w:start w:val="1"/>
+      <w:numFmt w:val="bullet"/>
+      <w:lvlText w:val=""/>
+      <w:lvlJc w:val="left"/>
+      <w:pPr>
+        <w:ind w:left="3960" w:hanging="440"/>
+      </w:pPr>
+      <w:rPr>
+        <w:rFonts w:ascii="Wingdings" w:hAnsi="Wingdings" w:hint="default"/>
+      </w:rPr>
+    </w:lvl>
+    <w:lvl w:ilvl="8" w:tplc="04090005" w:tentative="1">
+      <w:start w:val="1"/>
+      <w:numFmt w:val="bullet"/>
+      <w:lvlText w:val=""/>
+      <w:lvlJc w:val="left"/>
+      <w:pPr>
+        <w:ind w:left="4400" w:hanging="440"/>
+      </w:pPr>
+      <w:rPr>
+        <w:rFonts w:ascii="Wingdings" w:hAnsi="Wingdings" w:hint="default"/>
+      </w:rPr>
+    </w:lvl>
+  </w:abstractNum>
+  <w:abstractNum w:abstractNumId="12" w15:restartNumberingAfterBreak="0">
     <w:nsid w:val="3E6E318C"/>
     <w:multiLevelType w:val="multilevel"/>
     <w:tmpl w:val="E4C01B64"/>
@@ -5229,7 +5995,305 @@
       </w:rPr>
     </w:lvl>
   </w:abstractNum>
-  <w:abstractNum w:abstractNumId="11" w15:restartNumberingAfterBreak="0">
+  <w:abstractNum w:abstractNumId="13" w15:restartNumberingAfterBreak="0">
+    <w:nsid w:val="43277EB3"/>
+    <w:multiLevelType w:val="multilevel"/>
+    <w:tmpl w:val="F6AE1374"/>
+    <w:lvl w:ilvl="0">
+      <w:start w:val="1"/>
+      <w:numFmt w:val="bullet"/>
+      <w:lvlText w:val=""/>
+      <w:lvlJc w:val="left"/>
+      <w:pPr>
+        <w:tabs>
+          <w:tab w:val="num" w:pos="720"/>
+        </w:tabs>
+        <w:ind w:left="720" w:hanging="360"/>
+      </w:pPr>
+      <w:rPr>
+        <w:rFonts w:ascii="Symbol" w:hAnsi="Symbol" w:hint="default"/>
+        <w:sz w:val="20"/>
+      </w:rPr>
+    </w:lvl>
+    <w:lvl w:ilvl="1" w:tentative="1">
+      <w:start w:val="1"/>
+      <w:numFmt w:val="bullet"/>
+      <w:lvlText w:val="o"/>
+      <w:lvlJc w:val="left"/>
+      <w:pPr>
+        <w:tabs>
+          <w:tab w:val="num" w:pos="1440"/>
+        </w:tabs>
+        <w:ind w:left="1440" w:hanging="360"/>
+      </w:pPr>
+      <w:rPr>
+        <w:rFonts w:ascii="Courier New" w:hAnsi="Courier New" w:hint="default"/>
+        <w:sz w:val="20"/>
+      </w:rPr>
+    </w:lvl>
+    <w:lvl w:ilvl="2" w:tentative="1">
+      <w:start w:val="1"/>
+      <w:numFmt w:val="bullet"/>
+      <w:lvlText w:val=""/>
+      <w:lvlJc w:val="left"/>
+      <w:pPr>
+        <w:tabs>
+          <w:tab w:val="num" w:pos="2160"/>
+        </w:tabs>
+        <w:ind w:left="2160" w:hanging="360"/>
+      </w:pPr>
+      <w:rPr>
+        <w:rFonts w:ascii="Wingdings" w:hAnsi="Wingdings" w:hint="default"/>
+        <w:sz w:val="20"/>
+      </w:rPr>
+    </w:lvl>
+    <w:lvl w:ilvl="3" w:tentative="1">
+      <w:start w:val="1"/>
+      <w:numFmt w:val="bullet"/>
+      <w:lvlText w:val=""/>
+      <w:lvlJc w:val="left"/>
+      <w:pPr>
+        <w:tabs>
+          <w:tab w:val="num" w:pos="2880"/>
+        </w:tabs>
+        <w:ind w:left="2880" w:hanging="360"/>
+      </w:pPr>
+      <w:rPr>
+        <w:rFonts w:ascii="Wingdings" w:hAnsi="Wingdings" w:hint="default"/>
+        <w:sz w:val="20"/>
+      </w:rPr>
+    </w:lvl>
+    <w:lvl w:ilvl="4" w:tentative="1">
+      <w:start w:val="1"/>
+      <w:numFmt w:val="bullet"/>
+      <w:lvlText w:val=""/>
+      <w:lvlJc w:val="left"/>
+      <w:pPr>
+        <w:tabs>
+          <w:tab w:val="num" w:pos="3600"/>
+        </w:tabs>
+        <w:ind w:left="3600" w:hanging="360"/>
+      </w:pPr>
+      <w:rPr>
+        <w:rFonts w:ascii="Wingdings" w:hAnsi="Wingdings" w:hint="default"/>
+        <w:sz w:val="20"/>
+      </w:rPr>
+    </w:lvl>
+    <w:lvl w:ilvl="5" w:tentative="1">
+      <w:start w:val="1"/>
+      <w:numFmt w:val="bullet"/>
+      <w:lvlText w:val=""/>
+      <w:lvlJc w:val="left"/>
+      <w:pPr>
+        <w:tabs>
+          <w:tab w:val="num" w:pos="4320"/>
+        </w:tabs>
+        <w:ind w:left="4320" w:hanging="360"/>
+      </w:pPr>
+      <w:rPr>
+        <w:rFonts w:ascii="Wingdings" w:hAnsi="Wingdings" w:hint="default"/>
+        <w:sz w:val="20"/>
+      </w:rPr>
+    </w:lvl>
+    <w:lvl w:ilvl="6" w:tentative="1">
+      <w:start w:val="1"/>
+      <w:numFmt w:val="bullet"/>
+      <w:lvlText w:val=""/>
+      <w:lvlJc w:val="left"/>
+      <w:pPr>
+        <w:tabs>
+          <w:tab w:val="num" w:pos="5040"/>
+        </w:tabs>
+        <w:ind w:left="5040" w:hanging="360"/>
+      </w:pPr>
+      <w:rPr>
+        <w:rFonts w:ascii="Wingdings" w:hAnsi="Wingdings" w:hint="default"/>
+        <w:sz w:val="20"/>
+      </w:rPr>
+    </w:lvl>
+    <w:lvl w:ilvl="7" w:tentative="1">
+      <w:start w:val="1"/>
+      <w:numFmt w:val="bullet"/>
+      <w:lvlText w:val=""/>
+      <w:lvlJc w:val="left"/>
+      <w:pPr>
+        <w:tabs>
+          <w:tab w:val="num" w:pos="5760"/>
+        </w:tabs>
+        <w:ind w:left="5760" w:hanging="360"/>
+      </w:pPr>
+      <w:rPr>
+        <w:rFonts w:ascii="Wingdings" w:hAnsi="Wingdings" w:hint="default"/>
+        <w:sz w:val="20"/>
+      </w:rPr>
+    </w:lvl>
+    <w:lvl w:ilvl="8" w:tentative="1">
+      <w:start w:val="1"/>
+      <w:numFmt w:val="bullet"/>
+      <w:lvlText w:val=""/>
+      <w:lvlJc w:val="left"/>
+      <w:pPr>
+        <w:tabs>
+          <w:tab w:val="num" w:pos="6480"/>
+        </w:tabs>
+        <w:ind w:left="6480" w:hanging="360"/>
+      </w:pPr>
+      <w:rPr>
+        <w:rFonts w:ascii="Wingdings" w:hAnsi="Wingdings" w:hint="default"/>
+        <w:sz w:val="20"/>
+      </w:rPr>
+    </w:lvl>
+  </w:abstractNum>
+  <w:abstractNum w:abstractNumId="14" w15:restartNumberingAfterBreak="0">
+    <w:nsid w:val="44B228C2"/>
+    <w:multiLevelType w:val="multilevel"/>
+    <w:tmpl w:val="9448036A"/>
+    <w:lvl w:ilvl="0">
+      <w:start w:val="1"/>
+      <w:numFmt w:val="bullet"/>
+      <w:lvlText w:val=""/>
+      <w:lvlJc w:val="left"/>
+      <w:pPr>
+        <w:tabs>
+          <w:tab w:val="num" w:pos="720"/>
+        </w:tabs>
+        <w:ind w:left="720" w:hanging="360"/>
+      </w:pPr>
+      <w:rPr>
+        <w:rFonts w:ascii="Symbol" w:hAnsi="Symbol" w:hint="default"/>
+        <w:sz w:val="20"/>
+      </w:rPr>
+    </w:lvl>
+    <w:lvl w:ilvl="1" w:tentative="1">
+      <w:start w:val="1"/>
+      <w:numFmt w:val="bullet"/>
+      <w:lvlText w:val="o"/>
+      <w:lvlJc w:val="left"/>
+      <w:pPr>
+        <w:tabs>
+          <w:tab w:val="num" w:pos="1440"/>
+        </w:tabs>
+        <w:ind w:left="1440" w:hanging="360"/>
+      </w:pPr>
+      <w:rPr>
+        <w:rFonts w:ascii="Courier New" w:hAnsi="Courier New" w:hint="default"/>
+        <w:sz w:val="20"/>
+      </w:rPr>
+    </w:lvl>
+    <w:lvl w:ilvl="2" w:tentative="1">
+      <w:start w:val="1"/>
+      <w:numFmt w:val="bullet"/>
+      <w:lvlText w:val=""/>
+      <w:lvlJc w:val="left"/>
+      <w:pPr>
+        <w:tabs>
+          <w:tab w:val="num" w:pos="2160"/>
+        </w:tabs>
+        <w:ind w:left="2160" w:hanging="360"/>
+      </w:pPr>
+      <w:rPr>
+        <w:rFonts w:ascii="Wingdings" w:hAnsi="Wingdings" w:hint="default"/>
+        <w:sz w:val="20"/>
+      </w:rPr>
+    </w:lvl>
+    <w:lvl w:ilvl="3" w:tentative="1">
+      <w:start w:val="1"/>
+      <w:numFmt w:val="bullet"/>
+      <w:lvlText w:val=""/>
+      <w:lvlJc w:val="left"/>
+      <w:pPr>
+        <w:tabs>
+          <w:tab w:val="num" w:pos="2880"/>
+        </w:tabs>
+        <w:ind w:left="2880" w:hanging="360"/>
+      </w:pPr>
+      <w:rPr>
+        <w:rFonts w:ascii="Wingdings" w:hAnsi="Wingdings" w:hint="default"/>
+        <w:sz w:val="20"/>
+      </w:rPr>
+    </w:lvl>
+    <w:lvl w:ilvl="4" w:tentative="1">
+      <w:start w:val="1"/>
+      <w:numFmt w:val="bullet"/>
+      <w:lvlText w:val=""/>
+      <w:lvlJc w:val="left"/>
+      <w:pPr>
+        <w:tabs>
+          <w:tab w:val="num" w:pos="3600"/>
+        </w:tabs>
+        <w:ind w:left="3600" w:hanging="360"/>
+      </w:pPr>
+      <w:rPr>
+        <w:rFonts w:ascii="Wingdings" w:hAnsi="Wingdings" w:hint="default"/>
+        <w:sz w:val="20"/>
+      </w:rPr>
+    </w:lvl>
+    <w:lvl w:ilvl="5" w:tentative="1">
+      <w:start w:val="1"/>
+      <w:numFmt w:val="bullet"/>
+      <w:lvlText w:val=""/>
+      <w:lvlJc w:val="left"/>
+      <w:pPr>
+        <w:tabs>
+          <w:tab w:val="num" w:pos="4320"/>
+        </w:tabs>
+        <w:ind w:left="4320" w:hanging="360"/>
+      </w:pPr>
+      <w:rPr>
+        <w:rFonts w:ascii="Wingdings" w:hAnsi="Wingdings" w:hint="default"/>
+        <w:sz w:val="20"/>
+      </w:rPr>
+    </w:lvl>
+    <w:lvl w:ilvl="6" w:tentative="1">
+      <w:start w:val="1"/>
+      <w:numFmt w:val="bullet"/>
+      <w:lvlText w:val=""/>
+      <w:lvlJc w:val="left"/>
+      <w:pPr>
+        <w:tabs>
+          <w:tab w:val="num" w:pos="5040"/>
+        </w:tabs>
+        <w:ind w:left="5040" w:hanging="360"/>
+      </w:pPr>
+      <w:rPr>
+        <w:rFonts w:ascii="Wingdings" w:hAnsi="Wingdings" w:hint="default"/>
+        <w:sz w:val="20"/>
+      </w:rPr>
+    </w:lvl>
+    <w:lvl w:ilvl="7" w:tentative="1">
+      <w:start w:val="1"/>
+      <w:numFmt w:val="bullet"/>
+      <w:lvlText w:val=""/>
+      <w:lvlJc w:val="left"/>
+      <w:pPr>
+        <w:tabs>
+          <w:tab w:val="num" w:pos="5760"/>
+        </w:tabs>
+        <w:ind w:left="5760" w:hanging="360"/>
+      </w:pPr>
+      <w:rPr>
+        <w:rFonts w:ascii="Wingdings" w:hAnsi="Wingdings" w:hint="default"/>
+        <w:sz w:val="20"/>
+      </w:rPr>
+    </w:lvl>
+    <w:lvl w:ilvl="8" w:tentative="1">
+      <w:start w:val="1"/>
+      <w:numFmt w:val="bullet"/>
+      <w:lvlText w:val=""/>
+      <w:lvlJc w:val="left"/>
+      <w:pPr>
+        <w:tabs>
+          <w:tab w:val="num" w:pos="6480"/>
+        </w:tabs>
+        <w:ind w:left="6480" w:hanging="360"/>
+      </w:pPr>
+      <w:rPr>
+        <w:rFonts w:ascii="Wingdings" w:hAnsi="Wingdings" w:hint="default"/>
+        <w:sz w:val="20"/>
+      </w:rPr>
+    </w:lvl>
+  </w:abstractNum>
+  <w:abstractNum w:abstractNumId="15" w15:restartNumberingAfterBreak="0">
     <w:nsid w:val="50B43EC9"/>
     <w:multiLevelType w:val="hybridMultilevel"/>
     <w:tmpl w:val="DBE437C4"/>
@@ -5342,7 +6406,7 @@
       </w:rPr>
     </w:lvl>
   </w:abstractNum>
-  <w:abstractNum w:abstractNumId="12" w15:restartNumberingAfterBreak="0">
+  <w:abstractNum w:abstractNumId="16" w15:restartNumberingAfterBreak="0">
     <w:nsid w:val="526C3359"/>
     <w:multiLevelType w:val="hybridMultilevel"/>
     <w:tmpl w:val="42CAA792"/>
@@ -5358,7 +6422,7 @@
         <w:rFonts w:ascii="Symbol" w:hAnsi="Symbol" w:hint="default"/>
       </w:rPr>
     </w:lvl>
-    <w:lvl w:ilvl="1" w:tplc="10000003" w:tentative="1">
+    <w:lvl w:ilvl="1" w:tplc="10000003">
       <w:start w:val="1"/>
       <w:numFmt w:val="bullet"/>
       <w:lvlText w:val="o"/>
@@ -5455,7 +6519,7 @@
       </w:rPr>
     </w:lvl>
   </w:abstractNum>
-  <w:abstractNum w:abstractNumId="13" w15:restartNumberingAfterBreak="0">
+  <w:abstractNum w:abstractNumId="17" w15:restartNumberingAfterBreak="0">
     <w:nsid w:val="553B75B5"/>
     <w:multiLevelType w:val="multilevel"/>
     <w:tmpl w:val="D794FC36"/>
@@ -5604,7 +6668,7 @@
       </w:rPr>
     </w:lvl>
   </w:abstractNum>
-  <w:abstractNum w:abstractNumId="14" w15:restartNumberingAfterBreak="0">
+  <w:abstractNum w:abstractNumId="18" w15:restartNumberingAfterBreak="0">
     <w:nsid w:val="57EC420D"/>
     <w:multiLevelType w:val="hybridMultilevel"/>
     <w:tmpl w:val="87286D20"/>
@@ -5717,7 +6781,7 @@
       </w:rPr>
     </w:lvl>
   </w:abstractNum>
-  <w:abstractNum w:abstractNumId="15" w15:restartNumberingAfterBreak="0">
+  <w:abstractNum w:abstractNumId="19" w15:restartNumberingAfterBreak="0">
     <w:nsid w:val="65386310"/>
     <w:multiLevelType w:val="multilevel"/>
     <w:tmpl w:val="2D1035F4"/>
@@ -5866,7 +6930,7 @@
       </w:rPr>
     </w:lvl>
   </w:abstractNum>
-  <w:abstractNum w:abstractNumId="16" w15:restartNumberingAfterBreak="0">
+  <w:abstractNum w:abstractNumId="20" w15:restartNumberingAfterBreak="0">
     <w:nsid w:val="6FA3222C"/>
     <w:multiLevelType w:val="multilevel"/>
     <w:tmpl w:val="38742314"/>
@@ -6015,7 +7079,156 @@
       </w:rPr>
     </w:lvl>
   </w:abstractNum>
-  <w:abstractNum w:abstractNumId="17" w15:restartNumberingAfterBreak="0">
+  <w:abstractNum w:abstractNumId="21" w15:restartNumberingAfterBreak="0">
+    <w:nsid w:val="79FE599F"/>
+    <w:multiLevelType w:val="multilevel"/>
+    <w:tmpl w:val="D83AE75C"/>
+    <w:lvl w:ilvl="0">
+      <w:start w:val="1"/>
+      <w:numFmt w:val="bullet"/>
+      <w:lvlText w:val=""/>
+      <w:lvlJc w:val="left"/>
+      <w:pPr>
+        <w:tabs>
+          <w:tab w:val="num" w:pos="720"/>
+        </w:tabs>
+        <w:ind w:left="720" w:hanging="360"/>
+      </w:pPr>
+      <w:rPr>
+        <w:rFonts w:ascii="Symbol" w:hAnsi="Symbol" w:hint="default"/>
+        <w:sz w:val="20"/>
+      </w:rPr>
+    </w:lvl>
+    <w:lvl w:ilvl="1" w:tentative="1">
+      <w:start w:val="1"/>
+      <w:numFmt w:val="bullet"/>
+      <w:lvlText w:val="o"/>
+      <w:lvlJc w:val="left"/>
+      <w:pPr>
+        <w:tabs>
+          <w:tab w:val="num" w:pos="1440"/>
+        </w:tabs>
+        <w:ind w:left="1440" w:hanging="360"/>
+      </w:pPr>
+      <w:rPr>
+        <w:rFonts w:ascii="Courier New" w:hAnsi="Courier New" w:hint="default"/>
+        <w:sz w:val="20"/>
+      </w:rPr>
+    </w:lvl>
+    <w:lvl w:ilvl="2" w:tentative="1">
+      <w:start w:val="1"/>
+      <w:numFmt w:val="bullet"/>
+      <w:lvlText w:val=""/>
+      <w:lvlJc w:val="left"/>
+      <w:pPr>
+        <w:tabs>
+          <w:tab w:val="num" w:pos="2160"/>
+        </w:tabs>
+        <w:ind w:left="2160" w:hanging="360"/>
+      </w:pPr>
+      <w:rPr>
+        <w:rFonts w:ascii="Wingdings" w:hAnsi="Wingdings" w:hint="default"/>
+        <w:sz w:val="20"/>
+      </w:rPr>
+    </w:lvl>
+    <w:lvl w:ilvl="3" w:tentative="1">
+      <w:start w:val="1"/>
+      <w:numFmt w:val="bullet"/>
+      <w:lvlText w:val=""/>
+      <w:lvlJc w:val="left"/>
+      <w:pPr>
+        <w:tabs>
+          <w:tab w:val="num" w:pos="2880"/>
+        </w:tabs>
+        <w:ind w:left="2880" w:hanging="360"/>
+      </w:pPr>
+      <w:rPr>
+        <w:rFonts w:ascii="Wingdings" w:hAnsi="Wingdings" w:hint="default"/>
+        <w:sz w:val="20"/>
+      </w:rPr>
+    </w:lvl>
+    <w:lvl w:ilvl="4" w:tentative="1">
+      <w:start w:val="1"/>
+      <w:numFmt w:val="bullet"/>
+      <w:lvlText w:val=""/>
+      <w:lvlJc w:val="left"/>
+      <w:pPr>
+        <w:tabs>
+          <w:tab w:val="num" w:pos="3600"/>
+        </w:tabs>
+        <w:ind w:left="3600" w:hanging="360"/>
+      </w:pPr>
+      <w:rPr>
+        <w:rFonts w:ascii="Wingdings" w:hAnsi="Wingdings" w:hint="default"/>
+        <w:sz w:val="20"/>
+      </w:rPr>
+    </w:lvl>
+    <w:lvl w:ilvl="5" w:tentative="1">
+      <w:start w:val="1"/>
+      <w:numFmt w:val="bullet"/>
+      <w:lvlText w:val=""/>
+      <w:lvlJc w:val="left"/>
+      <w:pPr>
+        <w:tabs>
+          <w:tab w:val="num" w:pos="4320"/>
+        </w:tabs>
+        <w:ind w:left="4320" w:hanging="360"/>
+      </w:pPr>
+      <w:rPr>
+        <w:rFonts w:ascii="Wingdings" w:hAnsi="Wingdings" w:hint="default"/>
+        <w:sz w:val="20"/>
+      </w:rPr>
+    </w:lvl>
+    <w:lvl w:ilvl="6" w:tentative="1">
+      <w:start w:val="1"/>
+      <w:numFmt w:val="bullet"/>
+      <w:lvlText w:val=""/>
+      <w:lvlJc w:val="left"/>
+      <w:pPr>
+        <w:tabs>
+          <w:tab w:val="num" w:pos="5040"/>
+        </w:tabs>
+        <w:ind w:left="5040" w:hanging="360"/>
+      </w:pPr>
+      <w:rPr>
+        <w:rFonts w:ascii="Wingdings" w:hAnsi="Wingdings" w:hint="default"/>
+        <w:sz w:val="20"/>
+      </w:rPr>
+    </w:lvl>
+    <w:lvl w:ilvl="7" w:tentative="1">
+      <w:start w:val="1"/>
+      <w:numFmt w:val="bullet"/>
+      <w:lvlText w:val=""/>
+      <w:lvlJc w:val="left"/>
+      <w:pPr>
+        <w:tabs>
+          <w:tab w:val="num" w:pos="5760"/>
+        </w:tabs>
+        <w:ind w:left="5760" w:hanging="360"/>
+      </w:pPr>
+      <w:rPr>
+        <w:rFonts w:ascii="Wingdings" w:hAnsi="Wingdings" w:hint="default"/>
+        <w:sz w:val="20"/>
+      </w:rPr>
+    </w:lvl>
+    <w:lvl w:ilvl="8" w:tentative="1">
+      <w:start w:val="1"/>
+      <w:numFmt w:val="bullet"/>
+      <w:lvlText w:val=""/>
+      <w:lvlJc w:val="left"/>
+      <w:pPr>
+        <w:tabs>
+          <w:tab w:val="num" w:pos="6480"/>
+        </w:tabs>
+        <w:ind w:left="6480" w:hanging="360"/>
+      </w:pPr>
+      <w:rPr>
+        <w:rFonts w:ascii="Wingdings" w:hAnsi="Wingdings" w:hint="default"/>
+        <w:sz w:val="20"/>
+      </w:rPr>
+    </w:lvl>
+  </w:abstractNum>
+  <w:abstractNum w:abstractNumId="22" w15:restartNumberingAfterBreak="0">
     <w:nsid w:val="7DA45936"/>
     <w:multiLevelType w:val="hybridMultilevel"/>
     <w:tmpl w:val="96E07EFC"/>
@@ -6105,16 +7318,16 @@
     </w:lvl>
   </w:abstractNum>
   <w:num w:numId="1" w16cid:durableId="314989882">
-    <w:abstractNumId w:val="11"/>
+    <w:abstractNumId w:val="15"/>
   </w:num>
   <w:num w:numId="2" w16cid:durableId="960913941">
     <w:abstractNumId w:val="3"/>
   </w:num>
   <w:num w:numId="3" w16cid:durableId="820078393">
-    <w:abstractNumId w:val="14"/>
+    <w:abstractNumId w:val="18"/>
   </w:num>
   <w:num w:numId="4" w16cid:durableId="619343571">
-    <w:abstractNumId w:val="12"/>
+    <w:abstractNumId w:val="16"/>
   </w:num>
   <w:num w:numId="5" w16cid:durableId="1248423025">
     <w:abstractNumId w:val="2"/>
@@ -6129,7 +7342,7 @@
     <w:abstractNumId w:val="6"/>
   </w:num>
   <w:num w:numId="9" w16cid:durableId="697391651">
-    <w:abstractNumId w:val="17"/>
+    <w:abstractNumId w:val="22"/>
   </w:num>
   <w:num w:numId="10" w16cid:durableId="1392076842">
     <w:abstractNumId w:val="4"/>
@@ -6138,25 +7351,40 @@
     <w:abstractNumId w:val="7"/>
   </w:num>
   <w:num w:numId="12" w16cid:durableId="590773944">
-    <w:abstractNumId w:val="13"/>
+    <w:abstractNumId w:val="17"/>
   </w:num>
   <w:num w:numId="13" w16cid:durableId="377365902">
-    <w:abstractNumId w:val="15"/>
+    <w:abstractNumId w:val="19"/>
   </w:num>
   <w:num w:numId="14" w16cid:durableId="886726413">
-    <w:abstractNumId w:val="8"/>
+    <w:abstractNumId w:val="9"/>
   </w:num>
   <w:num w:numId="15" w16cid:durableId="1856728425">
     <w:abstractNumId w:val="1"/>
   </w:num>
   <w:num w:numId="16" w16cid:durableId="1835142783">
-    <w:abstractNumId w:val="9"/>
+    <w:abstractNumId w:val="10"/>
   </w:num>
   <w:num w:numId="17" w16cid:durableId="300383147">
-    <w:abstractNumId w:val="10"/>
+    <w:abstractNumId w:val="12"/>
   </w:num>
   <w:num w:numId="18" w16cid:durableId="204371579">
-    <w:abstractNumId w:val="16"/>
+    <w:abstractNumId w:val="20"/>
+  </w:num>
+  <w:num w:numId="19" w16cid:durableId="1695106050">
+    <w:abstractNumId w:val="11"/>
+  </w:num>
+  <w:num w:numId="20" w16cid:durableId="756487047">
+    <w:abstractNumId w:val="21"/>
+  </w:num>
+  <w:num w:numId="21" w16cid:durableId="1210612528">
+    <w:abstractNumId w:val="13"/>
+  </w:num>
+  <w:num w:numId="22" w16cid:durableId="1649476225">
+    <w:abstractNumId w:val="8"/>
+  </w:num>
+  <w:num w:numId="23" w16cid:durableId="955940592">
+    <w:abstractNumId w:val="14"/>
   </w:num>
 </w:numbering>
 </file>
@@ -7216,6 +8444,18 @@
       <w:rFonts w:ascii="Times New Roman" w:hAnsi="Times New Roman" w:cs="Times New Roman"/>
     </w:rPr>
   </w:style>
+  <w:style w:type="character" w:styleId="af">
+    <w:name w:val="Unresolved Mention"/>
+    <w:basedOn w:val="a0"/>
+    <w:uiPriority w:val="99"/>
+    <w:semiHidden/>
+    <w:unhideWhenUsed/>
+    <w:rsid w:val="0018067C"/>
+    <w:rPr>
+      <w:color w:val="605E5C"/>
+      <w:shd w:val="clear" w:color="auto" w:fill="E1DFDD"/>
+    </w:rPr>
+  </w:style>
 </w:styles>
 </file>
 

</xml_diff>